<commit_message>
defensereport & UserManual Link update
</commit_message>
<xml_diff>
--- a/Soutenance28-05/Report/Defense.docx
+++ b/Soutenance28-05/Report/Defense.docx
@@ -3558,6 +3558,960 @@
     <w:p>
       <w:pPr>
         <w:rPr>
+          <w:b/>
+          <w:bCs/>
+          <w:lang w:val="en-US"/>
+        </w:rPr>
+      </w:pPr>
+      <w:r>
+        <w:rPr>
+          <w:b/>
+          <w:bCs/>
+          <w:lang w:val="en-US"/>
+        </w:rPr>
+        <w:t>Objective</w:t>
+      </w:r>
+    </w:p>
+    <w:p>
+      <w:pPr>
+        <w:rPr>
+          <w:lang w:val="en-US"/>
+        </w:rPr>
+      </w:pPr>
+      <w:r>
+        <w:rPr>
+          <w:lang w:val="en-US"/>
+        </w:rPr>
+        <w:t>The primary objective of the shop system was to introduce a structured, intuitive interface that allows players to buy and sell in-game items, thereby supporting progression, strategic planning, and resource management. By establishing a functional in-game economy, the system enhances immersion and adds meaningful depth to the gameplay. The system also supports player agency by offering multiple avenues for acquiring equipment, resources, and allies critical for survival, exploration, and combat.</w:t>
+      </w:r>
+    </w:p>
+    <w:p>
+      <w:pPr>
+        <w:rPr>
+          <w:lang w:val="en-US"/>
+        </w:rPr>
+      </w:pPr>
+      <w:r>
+        <w:rPr>
+          <w:lang w:val="en-US"/>
+        </w:rPr>
+        <w:t xml:space="preserve">To serve this goal, six distinct shop types were </w:t>
+      </w:r>
+      <w:proofErr w:type="gramStart"/>
+      <w:r>
+        <w:rPr>
+          <w:lang w:val="en-US"/>
+        </w:rPr>
+        <w:t>designed—</w:t>
+      </w:r>
+      <w:proofErr w:type="gramEnd"/>
+      <w:r>
+        <w:rPr>
+          <w:lang w:val="en-US"/>
+        </w:rPr>
+        <w:t>each tailored to fulfill a specific role within the economy and support diverse player needs.</w:t>
+      </w:r>
+    </w:p>
+    <w:p>
+      <w:pPr>
+        <w:rPr>
+          <w:b/>
+          <w:bCs/>
+          <w:lang w:val="en-US"/>
+        </w:rPr>
+      </w:pPr>
+      <w:r>
+        <w:rPr>
+          <w:b/>
+          <w:bCs/>
+          <w:lang w:val="en-US"/>
+        </w:rPr>
+        <w:t>Technical Implementation</w:t>
+      </w:r>
+    </w:p>
+    <w:p>
+      <w:pPr>
+        <w:rPr>
+          <w:lang w:val="en-US"/>
+        </w:rPr>
+      </w:pPr>
+      <w:r>
+        <w:rPr>
+          <w:lang w:val="en-US"/>
+        </w:rPr>
+        <w:t>The shop system was built around six unique merchant types, each with specialized inventories and purposes:</w:t>
+      </w:r>
+    </w:p>
+    <w:p>
+      <w:pPr>
+        <w:numPr>
+          <w:ilvl w:val="0"/>
+          <w:numId w:val="16"/>
+        </w:numPr>
+        <w:rPr>
+          <w:lang w:val="en-US"/>
+        </w:rPr>
+      </w:pPr>
+      <w:r>
+        <w:rPr>
+          <w:b/>
+          <w:bCs/>
+          <w:lang w:val="en-US"/>
+        </w:rPr>
+        <w:t>Armorer</w:t>
+      </w:r>
+      <w:r>
+        <w:rPr>
+          <w:lang w:val="en-US"/>
+        </w:rPr>
+        <w:t>: Offers melee and ranged weapons.</w:t>
+      </w:r>
+    </w:p>
+    <w:p>
+      <w:pPr>
+        <w:numPr>
+          <w:ilvl w:val="0"/>
+          <w:numId w:val="16"/>
+        </w:numPr>
+        <w:rPr>
+          <w:lang w:val="en-US"/>
+        </w:rPr>
+      </w:pPr>
+      <w:r>
+        <w:rPr>
+          <w:b/>
+          <w:bCs/>
+          <w:lang w:val="en-US"/>
+        </w:rPr>
+        <w:t>Boat Salesman</w:t>
+      </w:r>
+      <w:r>
+        <w:rPr>
+          <w:lang w:val="en-US"/>
+        </w:rPr>
+        <w:t>: Provides various boats for travel and combat.</w:t>
+      </w:r>
+    </w:p>
+    <w:p>
+      <w:pPr>
+        <w:numPr>
+          <w:ilvl w:val="0"/>
+          <w:numId w:val="16"/>
+        </w:numPr>
+        <w:rPr>
+          <w:lang w:val="en-US"/>
+        </w:rPr>
+      </w:pPr>
+      <w:r>
+        <w:rPr>
+          <w:b/>
+          <w:bCs/>
+          <w:lang w:val="en-US"/>
+        </w:rPr>
+        <w:t>Mage</w:t>
+      </w:r>
+      <w:r>
+        <w:rPr>
+          <w:lang w:val="en-US"/>
+        </w:rPr>
+        <w:t>: Sells magical sigils and enchantments.</w:t>
+      </w:r>
+    </w:p>
+    <w:p>
+      <w:pPr>
+        <w:numPr>
+          <w:ilvl w:val="0"/>
+          <w:numId w:val="16"/>
+        </w:numPr>
+        <w:rPr>
+          <w:lang w:val="en-US"/>
+        </w:rPr>
+      </w:pPr>
+      <w:r>
+        <w:rPr>
+          <w:b/>
+          <w:bCs/>
+          <w:lang w:val="en-US"/>
+        </w:rPr>
+        <w:t>Crew Agent</w:t>
+      </w:r>
+      <w:r>
+        <w:rPr>
+          <w:lang w:val="en-US"/>
+        </w:rPr>
+        <w:t>: Enables the recruitment of crew members.</w:t>
+      </w:r>
+    </w:p>
+    <w:p>
+      <w:pPr>
+        <w:numPr>
+          <w:ilvl w:val="0"/>
+          <w:numId w:val="16"/>
+        </w:numPr>
+        <w:rPr>
+          <w:lang w:val="en-US"/>
+        </w:rPr>
+      </w:pPr>
+      <w:r>
+        <w:rPr>
+          <w:b/>
+          <w:bCs/>
+          <w:lang w:val="en-US"/>
+        </w:rPr>
+        <w:t>Material Merchant</w:t>
+      </w:r>
+      <w:r>
+        <w:rPr>
+          <w:lang w:val="en-US"/>
+        </w:rPr>
+        <w:t>: Supplies raw crafting materials such as steel, wood, and Pure Water Drops.</w:t>
+      </w:r>
+    </w:p>
+    <w:p>
+      <w:pPr>
+        <w:numPr>
+          <w:ilvl w:val="0"/>
+          <w:numId w:val="16"/>
+        </w:numPr>
+        <w:rPr>
+          <w:lang w:val="en-US"/>
+        </w:rPr>
+      </w:pPr>
+      <w:r>
+        <w:rPr>
+          <w:b/>
+          <w:bCs/>
+          <w:lang w:val="en-US"/>
+        </w:rPr>
+        <w:t>Sell Merchant</w:t>
+      </w:r>
+      <w:r>
+        <w:rPr>
+          <w:lang w:val="en-US"/>
+        </w:rPr>
+        <w:t>: Allows players to offload unused items for currency or materials.</w:t>
+      </w:r>
+    </w:p>
+    <w:p>
+      <w:pPr>
+        <w:rPr>
+          <w:lang w:val="en-US"/>
+        </w:rPr>
+      </w:pPr>
+      <w:r>
+        <w:rPr>
+          <w:lang w:val="en-US"/>
+        </w:rPr>
+        <w:t xml:space="preserve">Each merchant was implemented as an </w:t>
+      </w:r>
+      <w:r>
+        <w:rPr>
+          <w:b/>
+          <w:bCs/>
+          <w:lang w:val="en-US"/>
+        </w:rPr>
+        <w:t>interactable NPC prefab</w:t>
+      </w:r>
+      <w:r>
+        <w:rPr>
+          <w:lang w:val="en-US"/>
+        </w:rPr>
+        <w:t>, featuring unique visual designs. These prefabs were positioned throughout the game world in key locations to ensure logical access during gameplay.</w:t>
+      </w:r>
+    </w:p>
+    <w:p>
+      <w:pPr>
+        <w:rPr>
+          <w:lang w:val="en-US"/>
+        </w:rPr>
+      </w:pPr>
+      <w:r>
+        <w:rPr>
+          <w:lang w:val="en-US"/>
+        </w:rPr>
+        <w:t xml:space="preserve">Interaction with merchants was enabled using </w:t>
+      </w:r>
+      <w:r>
+        <w:rPr>
+          <w:b/>
+          <w:bCs/>
+          <w:lang w:val="en-US"/>
+        </w:rPr>
+        <w:t xml:space="preserve">Unity’s </w:t>
+      </w:r>
+      <w:proofErr w:type="spellStart"/>
+      <w:r>
+        <w:rPr>
+          <w:b/>
+          <w:bCs/>
+          <w:lang w:val="en-US"/>
+        </w:rPr>
+        <w:t>raycasting</w:t>
+      </w:r>
+      <w:proofErr w:type="spellEnd"/>
+      <w:r>
+        <w:rPr>
+          <w:b/>
+          <w:bCs/>
+          <w:lang w:val="en-US"/>
+        </w:rPr>
+        <w:t xml:space="preserve"> system</w:t>
+      </w:r>
+      <w:r>
+        <w:rPr>
+          <w:lang w:val="en-US"/>
+        </w:rPr>
+        <w:t>, allowing players to trigger specific shop menus by clicking on NPCs. Each merchant prefab includes a category identifier, which dynamically loads the corresponding inventory when accessed.</w:t>
+      </w:r>
+    </w:p>
+    <w:p>
+      <w:r>
+        <w:rPr>
+          <w:lang w:val="en-US"/>
+        </w:rPr>
+        <w:t xml:space="preserve">A </w:t>
+      </w:r>
+      <w:r>
+        <w:rPr>
+          <w:b/>
+          <w:bCs/>
+          <w:lang w:val="en-US"/>
+        </w:rPr>
+        <w:t>unified shop UI</w:t>
+      </w:r>
+      <w:r>
+        <w:rPr>
+          <w:lang w:val="en-US"/>
+        </w:rPr>
+        <w:t xml:space="preserve"> was created for all </w:t>
+      </w:r>
+      <w:proofErr w:type="gramStart"/>
+      <w:r>
+        <w:rPr>
+          <w:lang w:val="en-US"/>
+        </w:rPr>
+        <w:t>merchant types</w:t>
+      </w:r>
+      <w:proofErr w:type="gramEnd"/>
+      <w:r>
+        <w:rPr>
+          <w:lang w:val="en-US"/>
+        </w:rPr>
+        <w:t xml:space="preserve">, promoting visual consistency and intuitive navigation. </w:t>
+      </w:r>
+      <w:r>
+        <w:t xml:space="preserve">The </w:t>
+      </w:r>
+      <w:proofErr w:type="spellStart"/>
+      <w:r>
+        <w:t>shared</w:t>
+      </w:r>
+      <w:proofErr w:type="spellEnd"/>
+      <w:r>
+        <w:t xml:space="preserve"> interface </w:t>
+      </w:r>
+      <w:proofErr w:type="spellStart"/>
+      <w:proofErr w:type="gramStart"/>
+      <w:r>
+        <w:t>includes</w:t>
+      </w:r>
+      <w:proofErr w:type="spellEnd"/>
+      <w:r>
+        <w:t>:</w:t>
+      </w:r>
+      <w:proofErr w:type="gramEnd"/>
+    </w:p>
+    <w:p>
+      <w:pPr>
+        <w:numPr>
+          <w:ilvl w:val="0"/>
+          <w:numId w:val="17"/>
+        </w:numPr>
+        <w:rPr>
+          <w:lang w:val="en-US"/>
+        </w:rPr>
+      </w:pPr>
+      <w:r>
+        <w:rPr>
+          <w:b/>
+          <w:bCs/>
+          <w:lang w:val="en-US"/>
+        </w:rPr>
+        <w:t>Item Scroll View</w:t>
+      </w:r>
+      <w:r>
+        <w:rPr>
+          <w:lang w:val="en-US"/>
+        </w:rPr>
+        <w:t>: Displays merchant-specific items.</w:t>
+      </w:r>
+    </w:p>
+    <w:p>
+      <w:pPr>
+        <w:numPr>
+          <w:ilvl w:val="0"/>
+          <w:numId w:val="17"/>
+        </w:numPr>
+        <w:rPr>
+          <w:lang w:val="en-US"/>
+        </w:rPr>
+      </w:pPr>
+      <w:r>
+        <w:rPr>
+          <w:b/>
+          <w:bCs/>
+          <w:lang w:val="en-US"/>
+        </w:rPr>
+        <w:t>Item Description Panel</w:t>
+      </w:r>
+      <w:r>
+        <w:rPr>
+          <w:lang w:val="en-US"/>
+        </w:rPr>
+        <w:t>: Shows item details (e.g., stats, rarity, material costs).</w:t>
+      </w:r>
+    </w:p>
+    <w:p>
+      <w:pPr>
+        <w:numPr>
+          <w:ilvl w:val="0"/>
+          <w:numId w:val="17"/>
+        </w:numPr>
+        <w:rPr>
+          <w:lang w:val="en-US"/>
+        </w:rPr>
+      </w:pPr>
+      <w:r>
+        <w:rPr>
+          <w:b/>
+          <w:bCs/>
+          <w:lang w:val="en-US"/>
+        </w:rPr>
+        <w:t>Player Resources Display</w:t>
+      </w:r>
+      <w:r>
+        <w:rPr>
+          <w:lang w:val="en-US"/>
+        </w:rPr>
+        <w:t>: Reflects current coin, material, and Pure Water Drop counts.</w:t>
+      </w:r>
+    </w:p>
+    <w:p>
+      <w:pPr>
+        <w:numPr>
+          <w:ilvl w:val="0"/>
+          <w:numId w:val="17"/>
+        </w:numPr>
+        <w:rPr>
+          <w:lang w:val="en-US"/>
+        </w:rPr>
+      </w:pPr>
+      <w:r>
+        <w:rPr>
+          <w:b/>
+          <w:bCs/>
+          <w:lang w:val="en-US"/>
+        </w:rPr>
+        <w:t>Buy/Sell Buttons</w:t>
+      </w:r>
+      <w:r>
+        <w:rPr>
+          <w:lang w:val="en-US"/>
+        </w:rPr>
+        <w:t>: Executes the appropriate transaction logic based on the shop type.</w:t>
+      </w:r>
+    </w:p>
+    <w:p>
+      <w:pPr>
+        <w:rPr>
+          <w:lang w:val="en-US"/>
+        </w:rPr>
+      </w:pPr>
+      <w:r>
+        <w:rPr>
+          <w:lang w:val="en-US"/>
+        </w:rPr>
+        <w:t>The modular UI structure allowed for easy adaptation between shop types, with backend scripts dynamically populating the item list based on the interacting merchant.</w:t>
+      </w:r>
+    </w:p>
+    <w:p>
+      <w:pPr>
+        <w:rPr>
+          <w:b/>
+          <w:bCs/>
+          <w:lang w:val="en-US"/>
+        </w:rPr>
+      </w:pPr>
+      <w:r>
+        <w:rPr>
+          <w:b/>
+          <w:bCs/>
+          <w:lang w:val="en-US"/>
+        </w:rPr>
+        <w:t>Inventory &amp; Economy Integration</w:t>
+      </w:r>
+    </w:p>
+    <w:p>
+      <w:r>
+        <w:rPr>
+          <w:lang w:val="en-US"/>
+        </w:rPr>
+        <w:lastRenderedPageBreak/>
+        <w:t xml:space="preserve">The shop system was built on top of the existing </w:t>
+      </w:r>
+      <w:r>
+        <w:rPr>
+          <w:b/>
+          <w:bCs/>
+          <w:lang w:val="en-US"/>
+        </w:rPr>
+        <w:t>inventory infrastructure</w:t>
+      </w:r>
+      <w:r>
+        <w:rPr>
+          <w:lang w:val="en-US"/>
+        </w:rPr>
+        <w:t xml:space="preserve">, allowing for efficient reuse of scripts and interfaces. </w:t>
+      </w:r>
+      <w:r>
+        <w:t xml:space="preserve">Key </w:t>
+      </w:r>
+      <w:proofErr w:type="spellStart"/>
+      <w:r>
+        <w:t>enhancements</w:t>
+      </w:r>
+      <w:proofErr w:type="spellEnd"/>
+      <w:r>
+        <w:t xml:space="preserve"> </w:t>
+      </w:r>
+      <w:proofErr w:type="spellStart"/>
+      <w:proofErr w:type="gramStart"/>
+      <w:r>
+        <w:t>included</w:t>
+      </w:r>
+      <w:proofErr w:type="spellEnd"/>
+      <w:r>
+        <w:t>:</w:t>
+      </w:r>
+      <w:proofErr w:type="gramEnd"/>
+    </w:p>
+    <w:p>
+      <w:pPr>
+        <w:numPr>
+          <w:ilvl w:val="0"/>
+          <w:numId w:val="18"/>
+        </w:numPr>
+        <w:rPr>
+          <w:lang w:val="en-US"/>
+        </w:rPr>
+      </w:pPr>
+      <w:r>
+        <w:rPr>
+          <w:b/>
+          <w:bCs/>
+          <w:lang w:val="en-US"/>
+        </w:rPr>
+        <w:t>Buy Logic</w:t>
+      </w:r>
+      <w:r>
+        <w:rPr>
+          <w:lang w:val="en-US"/>
+        </w:rPr>
+        <w:t>: Checks player resource availability before confirming purchases. Successful transactions add the item to the player’s inventory and deduct the appropriate cost.</w:t>
+      </w:r>
+    </w:p>
+    <w:p>
+      <w:pPr>
+        <w:numPr>
+          <w:ilvl w:val="0"/>
+          <w:numId w:val="18"/>
+        </w:numPr>
+        <w:rPr>
+          <w:lang w:val="en-US"/>
+        </w:rPr>
+      </w:pPr>
+      <w:r>
+        <w:rPr>
+          <w:b/>
+          <w:bCs/>
+          <w:lang w:val="en-US"/>
+        </w:rPr>
+        <w:t>Sell Logic</w:t>
+      </w:r>
+      <w:r>
+        <w:rPr>
+          <w:lang w:val="en-US"/>
+        </w:rPr>
+        <w:t>: Displays all inventory items in the Sell Menu. Items can be sold for coins or materials, freeing inventory space and rewarding players with resources.</w:t>
+      </w:r>
+    </w:p>
+    <w:p>
+      <w:pPr>
+        <w:numPr>
+          <w:ilvl w:val="0"/>
+          <w:numId w:val="18"/>
+        </w:numPr>
+        <w:rPr>
+          <w:lang w:val="en-US"/>
+        </w:rPr>
+      </w:pPr>
+      <w:r>
+        <w:rPr>
+          <w:b/>
+          <w:bCs/>
+          <w:lang w:val="en-US"/>
+        </w:rPr>
+        <w:t>Real-Time UI Updates</w:t>
+      </w:r>
+      <w:r>
+        <w:rPr>
+          <w:lang w:val="en-US"/>
+        </w:rPr>
+        <w:t>: Ensures immediate feedback on transactions, reflecting changes to inventory and resource values.</w:t>
+      </w:r>
+    </w:p>
+    <w:p>
+      <w:pPr>
+        <w:rPr>
+          <w:lang w:val="en-US"/>
+        </w:rPr>
+      </w:pPr>
+      <w:r>
+        <w:rPr>
+          <w:lang w:val="en-US"/>
+        </w:rPr>
+        <w:t xml:space="preserve">Inventory data was managed through </w:t>
+      </w:r>
+      <w:r>
+        <w:rPr>
+          <w:b/>
+          <w:bCs/>
+          <w:lang w:val="en-US"/>
+        </w:rPr>
+        <w:t>scriptable objects and categorized item databases</w:t>
+      </w:r>
+      <w:r>
+        <w:rPr>
+          <w:lang w:val="en-US"/>
+        </w:rPr>
+        <w:t>. These databases were referenced at runtime based on the merchant type, enabling dynamic population of each merchant’s offerings without hardcoded lists.</w:t>
+      </w:r>
+    </w:p>
+    <w:p>
+      <w:pPr>
+        <w:rPr>
+          <w:b/>
+          <w:bCs/>
+          <w:lang w:val="en-US"/>
+        </w:rPr>
+      </w:pPr>
+      <w:r>
+        <w:rPr>
+          <w:b/>
+          <w:bCs/>
+          <w:lang w:val="en-US"/>
+        </w:rPr>
+        <w:t>Expanding Functionality with New Merchant Types</w:t>
+      </w:r>
+    </w:p>
+    <w:p>
+      <w:pPr>
+        <w:rPr>
+          <w:lang w:val="en-US"/>
+        </w:rPr>
+      </w:pPr>
+      <w:r>
+        <w:rPr>
+          <w:lang w:val="en-US"/>
+        </w:rPr>
+        <w:t xml:space="preserve">During development, it became evident that players lacked a reliable way to acquire </w:t>
+      </w:r>
+      <w:r>
+        <w:rPr>
+          <w:b/>
+          <w:bCs/>
+          <w:lang w:val="en-US"/>
+        </w:rPr>
+        <w:t>core crafting materials</w:t>
+      </w:r>
+      <w:r>
+        <w:rPr>
+          <w:lang w:val="en-US"/>
+        </w:rPr>
+        <w:t xml:space="preserve">. To resolve this, the </w:t>
+      </w:r>
+      <w:r>
+        <w:rPr>
+          <w:b/>
+          <w:bCs/>
+          <w:lang w:val="en-US"/>
+        </w:rPr>
+        <w:t>Material Merchant</w:t>
+      </w:r>
+      <w:r>
+        <w:rPr>
+          <w:lang w:val="en-US"/>
+        </w:rPr>
+        <w:t xml:space="preserve"> was introduced. This shop type followed the same UI and prefab structure but was connected to a materials-specific item database. It provided access to critical upgrade components and allowed for more balanced pacing in player progression.</w:t>
+      </w:r>
+    </w:p>
+    <w:p>
+      <w:pPr>
+        <w:rPr>
+          <w:lang w:val="en-US"/>
+        </w:rPr>
+      </w:pPr>
+      <w:r>
+        <w:rPr>
+          <w:lang w:val="en-US"/>
+        </w:rPr>
+        <w:t xml:space="preserve">Similarly, the </w:t>
+      </w:r>
+      <w:r>
+        <w:rPr>
+          <w:b/>
+          <w:bCs/>
+          <w:lang w:val="en-US"/>
+        </w:rPr>
+        <w:t>Sell Merchant</w:t>
+      </w:r>
+      <w:r>
+        <w:rPr>
+          <w:lang w:val="en-US"/>
+        </w:rPr>
+        <w:t xml:space="preserve"> was created to complete the economic loop. The sell system reused the inventory UI, replacing the Upgrade button with a Sell button that removed the item from the inventory and rewarded the player accordingly. Sell values were predefined based on item rarity and category.</w:t>
+      </w:r>
+    </w:p>
+    <w:p>
+      <w:pPr>
+        <w:rPr>
+          <w:lang w:val="en-US"/>
+        </w:rPr>
+      </w:pPr>
+      <w:r>
+        <w:rPr>
+          <w:lang w:val="en-US"/>
+        </w:rPr>
+        <w:t>Both new shop types were implemented efficiently due to the modularity of the shop UI and the flexible inventory system, requiring only minor adjustments to existing scripts.</w:t>
+      </w:r>
+    </w:p>
+    <w:p>
+      <w:pPr>
+        <w:rPr>
+          <w:b/>
+          <w:bCs/>
+          <w:lang w:val="en-US"/>
+        </w:rPr>
+      </w:pPr>
+      <w:r>
+        <w:rPr>
+          <w:b/>
+          <w:bCs/>
+          <w:lang w:val="en-US"/>
+        </w:rPr>
+        <w:t>Result</w:t>
+      </w:r>
+    </w:p>
+    <w:p>
+      <w:pPr>
+        <w:rPr>
+          <w:lang w:val="en-US"/>
+        </w:rPr>
+      </w:pPr>
+      <w:r>
+        <w:rPr>
+          <w:lang w:val="en-US"/>
+        </w:rPr>
+        <w:t>The fully implemented shop system introduced a diverse and meaningful layer of interactivity to the game’s economic structure. With six distinct shop types covering equipment, magic, transport, personnel, resources, and item resale, players are empowered to make strategic decisions tailored to their playstyle and objectives.</w:t>
+      </w:r>
+    </w:p>
+    <w:p>
+      <w:r>
+        <w:t xml:space="preserve">Key </w:t>
+      </w:r>
+      <w:proofErr w:type="spellStart"/>
+      <w:r>
+        <w:t>results</w:t>
+      </w:r>
+      <w:proofErr w:type="spellEnd"/>
+      <w:r>
+        <w:t xml:space="preserve"> </w:t>
+      </w:r>
+      <w:proofErr w:type="spellStart"/>
+      <w:proofErr w:type="gramStart"/>
+      <w:r>
+        <w:t>include</w:t>
+      </w:r>
+      <w:proofErr w:type="spellEnd"/>
+      <w:r>
+        <w:t>:</w:t>
+      </w:r>
+      <w:proofErr w:type="gramEnd"/>
+    </w:p>
+    <w:p>
+      <w:pPr>
+        <w:numPr>
+          <w:ilvl w:val="0"/>
+          <w:numId w:val="19"/>
+        </w:numPr>
+        <w:rPr>
+          <w:lang w:val="en-US"/>
+        </w:rPr>
+      </w:pPr>
+      <w:r>
+        <w:rPr>
+          <w:lang w:val="en-US"/>
+        </w:rPr>
+        <w:t xml:space="preserve">A </w:t>
+      </w:r>
+      <w:r>
+        <w:rPr>
+          <w:b/>
+          <w:bCs/>
+          <w:lang w:val="en-US"/>
+        </w:rPr>
+        <w:t>consistent and intuitive UI</w:t>
+      </w:r>
+      <w:r>
+        <w:rPr>
+          <w:lang w:val="en-US"/>
+        </w:rPr>
+        <w:t xml:space="preserve"> across all shop interactions.</w:t>
+      </w:r>
+    </w:p>
+    <w:p>
+      <w:pPr>
+        <w:numPr>
+          <w:ilvl w:val="0"/>
+          <w:numId w:val="19"/>
+        </w:numPr>
+        <w:rPr>
+          <w:lang w:val="en-US"/>
+        </w:rPr>
+      </w:pPr>
+      <w:r>
+        <w:rPr>
+          <w:b/>
+          <w:bCs/>
+          <w:lang w:val="en-US"/>
+        </w:rPr>
+        <w:t>Efficient transaction handling</w:t>
+      </w:r>
+      <w:r>
+        <w:rPr>
+          <w:lang w:val="en-US"/>
+        </w:rPr>
+        <w:t>, tied directly into the player’s resource and inventory systems.</w:t>
+      </w:r>
+    </w:p>
+    <w:p>
+      <w:pPr>
+        <w:numPr>
+          <w:ilvl w:val="0"/>
+          <w:numId w:val="19"/>
+        </w:numPr>
+        <w:rPr>
+          <w:lang w:val="en-US"/>
+        </w:rPr>
+      </w:pPr>
+      <w:r>
+        <w:rPr>
+          <w:b/>
+          <w:bCs/>
+          <w:lang w:val="en-US"/>
+        </w:rPr>
+        <w:t>Improved pacing and balance</w:t>
+      </w:r>
+      <w:r>
+        <w:rPr>
+          <w:lang w:val="en-US"/>
+        </w:rPr>
+        <w:t>, enabled by resource merchants and resale mechanics.</w:t>
+      </w:r>
+    </w:p>
+    <w:p>
+      <w:pPr>
+        <w:numPr>
+          <w:ilvl w:val="0"/>
+          <w:numId w:val="19"/>
+        </w:numPr>
+        <w:rPr>
+          <w:lang w:val="en-US"/>
+        </w:rPr>
+      </w:pPr>
+      <w:r>
+        <w:rPr>
+          <w:b/>
+          <w:bCs/>
+          <w:lang w:val="en-US"/>
+        </w:rPr>
+        <w:t>Enhanced immersion</w:t>
+      </w:r>
+      <w:r>
+        <w:rPr>
+          <w:lang w:val="en-US"/>
+        </w:rPr>
+        <w:t>, driven by unique merchant NPCs and logical shop placements within the world.</w:t>
+      </w:r>
+    </w:p>
+    <w:p>
+      <w:pPr>
+        <w:rPr>
+          <w:lang w:val="en-US"/>
+        </w:rPr>
+      </w:pPr>
+      <w:r>
+        <w:rPr>
+          <w:lang w:val="en-US"/>
+        </w:rPr>
+        <w:t xml:space="preserve">This system not only enriches moment-to-moment gameplay but also lays the groundwork for potential future systems, including </w:t>
+      </w:r>
+      <w:r>
+        <w:rPr>
+          <w:b/>
+          <w:bCs/>
+          <w:lang w:val="en-US"/>
+        </w:rPr>
+        <w:t>advanced crafting</w:t>
+      </w:r>
+      <w:r>
+        <w:rPr>
+          <w:lang w:val="en-US"/>
+        </w:rPr>
+        <w:t xml:space="preserve">, </w:t>
+      </w:r>
+      <w:r>
+        <w:rPr>
+          <w:b/>
+          <w:bCs/>
+          <w:lang w:val="en-US"/>
+        </w:rPr>
+        <w:t>faction-based economies</w:t>
+      </w:r>
+      <w:r>
+        <w:rPr>
+          <w:lang w:val="en-US"/>
+        </w:rPr>
+        <w:t xml:space="preserve">, or </w:t>
+      </w:r>
+      <w:r>
+        <w:rPr>
+          <w:b/>
+          <w:bCs/>
+          <w:lang w:val="en-US"/>
+        </w:rPr>
+        <w:t>dynamic pricing models</w:t>
+      </w:r>
+      <w:r>
+        <w:rPr>
+          <w:lang w:val="en-US"/>
+        </w:rPr>
+        <w:t>. The modular and scalable design ensures that the shop system can evolve in complexity as the game continues to grow.</w:t>
+      </w:r>
+    </w:p>
+    <w:p>
+      <w:pPr>
+        <w:rPr>
           <w:lang w:val="en-US"/>
         </w:rPr>
       </w:pPr>
@@ -3573,6 +4527,13 @@
           <w:lang w:val="en-US"/>
         </w:rPr>
         <w:br w:type="page"/>
+      </w:r>
+      <w:r>
+        <w:rPr>
+          <w:lang w:val="en-US"/>
+        </w:rPr>
+        <w:lastRenderedPageBreak/>
+        <w:t xml:space="preserve">    </w:t>
       </w:r>
     </w:p>
     <w:p>
@@ -3595,16 +4556,437 @@
           <w:u w:val="single"/>
           <w:lang w:val="en-US"/>
         </w:rPr>
+        <w:t>Fishing system</w:t>
+      </w:r>
+    </w:p>
+    <w:p>
+      <w:pPr>
+        <w:rPr>
+          <w:b/>
+          <w:bCs/>
+          <w:lang w:val="en-US"/>
+        </w:rPr>
+      </w:pPr>
+      <w:r>
+        <w:rPr>
+          <w:b/>
+          <w:bCs/>
+          <w:lang w:val="en-US"/>
+        </w:rPr>
+        <w:t>Objective</w:t>
+      </w:r>
+    </w:p>
+    <w:p>
+      <w:pPr>
+        <w:rPr>
+          <w:lang w:val="en-US"/>
+        </w:rPr>
+      </w:pPr>
+      <w:r>
+        <w:rPr>
+          <w:lang w:val="en-US"/>
+        </w:rPr>
+        <w:t xml:space="preserve">The goal of the fishing system was to introduce a unique, interactive minigame that adds variety to player activities while supporting core survival and economic mechanics. Fishing allows players to gather food to manage hunger, </w:t>
+      </w:r>
+      <w:proofErr w:type="gramStart"/>
+      <w:r>
+        <w:rPr>
+          <w:lang w:val="en-US"/>
+        </w:rPr>
+        <w:t>and also</w:t>
+      </w:r>
+      <w:proofErr w:type="gramEnd"/>
+      <w:r>
+        <w:rPr>
+          <w:lang w:val="en-US"/>
+        </w:rPr>
+        <w:t xml:space="preserve"> to sell caught fish for in-game currency. The system was designed to be immersive and skill-based, creating a more dynamic and rewarding gameplay experience within the game world.</w:t>
+      </w:r>
+    </w:p>
+    <w:p>
+      <w:pPr>
+        <w:rPr>
+          <w:b/>
+          <w:bCs/>
+          <w:lang w:val="en-US"/>
+        </w:rPr>
+      </w:pPr>
+      <w:r>
+        <w:rPr>
+          <w:b/>
+          <w:bCs/>
+          <w:lang w:val="en-US"/>
+        </w:rPr>
+        <w:t>Technical Implementation</w:t>
+      </w:r>
+    </w:p>
+    <w:p>
+      <w:pPr>
+        <w:rPr>
+          <w:lang w:val="en-US"/>
+        </w:rPr>
+      </w:pPr>
+      <w:r>
+        <w:rPr>
+          <w:lang w:val="en-US"/>
+        </w:rPr>
+        <w:t xml:space="preserve">The fishing mechanic was initially conceptualized as a </w:t>
+      </w:r>
+      <w:r>
+        <w:rPr>
+          <w:b/>
+          <w:bCs/>
+          <w:lang w:val="en-US"/>
+        </w:rPr>
+        <w:t>reaction-based minigame</w:t>
+      </w:r>
+      <w:r>
+        <w:rPr>
+          <w:lang w:val="en-US"/>
+        </w:rPr>
+        <w:t xml:space="preserve"> triggered by player interaction with fishing ponds located throughout the game world. </w:t>
+      </w:r>
+      <w:proofErr w:type="gramStart"/>
+      <w:r>
+        <w:rPr>
+          <w:lang w:val="en-US"/>
+        </w:rPr>
+        <w:t>The core</w:t>
+      </w:r>
+      <w:proofErr w:type="gramEnd"/>
+      <w:r>
+        <w:rPr>
+          <w:lang w:val="en-US"/>
+        </w:rPr>
+        <w:t xml:space="preserve"> gameplay involved clicking on moving fish to catch them, with each fish moving unpredictably to challenge the player’s reflexes and accuracy.</w:t>
+      </w:r>
+    </w:p>
+    <w:p>
+      <w:pPr>
+        <w:rPr>
+          <w:lang w:val="en-US"/>
+        </w:rPr>
+      </w:pPr>
+      <w:r>
+        <w:rPr>
+          <w:lang w:val="en-US"/>
+        </w:rPr>
+        <w:t xml:space="preserve">The first prototype was implemented in a 3D environment. A fixed camera faced the pond as five fish moved laterally using sinusoidal motion, achieved with </w:t>
+      </w:r>
+      <w:proofErr w:type="spellStart"/>
+      <w:r>
+        <w:rPr>
+          <w:lang w:val="en-US"/>
+        </w:rPr>
+        <w:t>Mathf.Sin</w:t>
+      </w:r>
+      <w:proofErr w:type="spellEnd"/>
+      <w:r>
+        <w:rPr>
+          <w:lang w:val="en-US"/>
+        </w:rPr>
+        <w:t>() in Unity. Fish were recycled to the left side of the screen upon reaching the right boundary to maintain gameplay flow. Extensive testing determined that five fish provided an ideal balance between difficulty and accessibility.</w:t>
+      </w:r>
+    </w:p>
+    <w:p>
+      <w:pPr>
+        <w:rPr>
+          <w:lang w:val="en-US"/>
+        </w:rPr>
+      </w:pPr>
+      <w:r>
+        <w:rPr>
+          <w:lang w:val="en-US"/>
+        </w:rPr>
+        <w:t xml:space="preserve">After evaluating performance and user interaction, the system was reworked using Unity’s </w:t>
+      </w:r>
+      <w:r>
+        <w:rPr>
+          <w:b/>
+          <w:bCs/>
+          <w:lang w:val="en-US"/>
+        </w:rPr>
+        <w:t>2D Canvas UI</w:t>
+      </w:r>
+      <w:r>
+        <w:rPr>
+          <w:lang w:val="en-US"/>
+        </w:rPr>
+        <w:t xml:space="preserve"> for better precision and optimization. Fish were converted into clickable </w:t>
+      </w:r>
+      <w:r>
+        <w:rPr>
+          <w:b/>
+          <w:bCs/>
+          <w:lang w:val="en-US"/>
+        </w:rPr>
+        <w:t>UI Buttons</w:t>
+      </w:r>
+      <w:r>
+        <w:rPr>
+          <w:lang w:val="en-US"/>
+        </w:rPr>
+        <w:t>, improving input responsiveness and simplifying detection logic using Unity's built-in UI system.</w:t>
+      </w:r>
+    </w:p>
+    <w:p>
+      <w:pPr>
+        <w:rPr>
+          <w:lang w:val="en-US"/>
+        </w:rPr>
+      </w:pPr>
+      <w:r>
+        <w:rPr>
+          <w:lang w:val="en-US"/>
+        </w:rPr>
+        <w:t xml:space="preserve">This required converting </w:t>
+      </w:r>
+      <w:proofErr w:type="spellStart"/>
+      <w:r>
+        <w:rPr>
+          <w:lang w:val="en-US"/>
+        </w:rPr>
+        <w:t>GameObjects</w:t>
+      </w:r>
+      <w:proofErr w:type="spellEnd"/>
+      <w:r>
+        <w:rPr>
+          <w:lang w:val="en-US"/>
+        </w:rPr>
+        <w:t xml:space="preserve"> from Transform to </w:t>
+      </w:r>
+      <w:proofErr w:type="spellStart"/>
+      <w:proofErr w:type="gramStart"/>
+      <w:r>
+        <w:rPr>
+          <w:lang w:val="en-US"/>
+        </w:rPr>
+        <w:t>RectTransform</w:t>
+      </w:r>
+      <w:proofErr w:type="spellEnd"/>
+      <w:r>
+        <w:rPr>
+          <w:lang w:val="en-US"/>
+        </w:rPr>
+        <w:t>, and</w:t>
+      </w:r>
+      <w:proofErr w:type="gramEnd"/>
+      <w:r>
+        <w:rPr>
+          <w:lang w:val="en-US"/>
+        </w:rPr>
+        <w:t xml:space="preserve"> adjusting movement logic to function within the UI layout. Movement speed and screen boundaries were recalibrated to suit the 2D space, maintaining smooth and natural animation within the interface.</w:t>
+      </w:r>
+    </w:p>
+    <w:p>
+      <w:pPr>
+        <w:rPr>
+          <w:lang w:val="en-US"/>
+        </w:rPr>
+      </w:pPr>
+      <w:r>
+        <w:rPr>
+          <w:lang w:val="en-US"/>
+        </w:rPr>
+        <w:t xml:space="preserve">To reward the player and support game progression, the inventory system was updated to include fish as a new item type. Upon each successful click, the player's </w:t>
+      </w:r>
+      <w:r>
+        <w:rPr>
+          <w:b/>
+          <w:bCs/>
+          <w:lang w:val="en-US"/>
+        </w:rPr>
+        <w:t>fish count</w:t>
+      </w:r>
+      <w:r>
+        <w:rPr>
+          <w:lang w:val="en-US"/>
+        </w:rPr>
+        <w:t xml:space="preserve"> was incremented via a dedicated inventory function.</w:t>
+      </w:r>
+    </w:p>
+    <w:p>
+      <w:pPr>
+        <w:rPr>
+          <w:lang w:val="en-US"/>
+        </w:rPr>
+      </w:pPr>
+      <w:r>
+        <w:rPr>
+          <w:lang w:val="en-US"/>
+        </w:rPr>
+        <w:t xml:space="preserve">A real-time </w:t>
+      </w:r>
+      <w:r>
+        <w:rPr>
+          <w:b/>
+          <w:bCs/>
+          <w:lang w:val="en-US"/>
+        </w:rPr>
+        <w:t>fish counter</w:t>
+      </w:r>
+      <w:r>
+        <w:rPr>
+          <w:lang w:val="en-US"/>
+        </w:rPr>
+        <w:t xml:space="preserve"> UI element was also added to the interface. It updated instantly upon catching a fish, providing satisfying feedback and reinforcing a sense of achievement.</w:t>
+      </w:r>
+    </w:p>
+    <w:p>
+      <w:pPr>
+        <w:rPr>
+          <w:lang w:val="en-US"/>
+        </w:rPr>
+      </w:pPr>
+      <w:r>
+        <w:rPr>
+          <w:lang w:val="en-US"/>
+        </w:rPr>
+        <w:t xml:space="preserve">Initially, caught fish were removed from the scene, gradually reducing the number of targets. This disrupted the gameplay flow and required players to restart the minigame. The mechanic was revised so that </w:t>
+      </w:r>
+      <w:r>
+        <w:rPr>
+          <w:b/>
+          <w:bCs/>
+          <w:lang w:val="en-US"/>
+        </w:rPr>
+        <w:t>new fish spawned immediately</w:t>
+      </w:r>
+      <w:r>
+        <w:rPr>
+          <w:lang w:val="en-US"/>
+        </w:rPr>
+        <w:t xml:space="preserve"> upon a successful catch, creating a </w:t>
+      </w:r>
+      <w:r>
+        <w:rPr>
+          <w:b/>
+          <w:bCs/>
+          <w:lang w:val="en-US"/>
+        </w:rPr>
+        <w:t>seamless and continuous</w:t>
+      </w:r>
+      <w:r>
+        <w:rPr>
+          <w:lang w:val="en-US"/>
+        </w:rPr>
+        <w:t xml:space="preserve"> fishing experience.</w:t>
+      </w:r>
+    </w:p>
+    <w:p>
+      <w:pPr>
+        <w:rPr>
+          <w:lang w:val="en-US"/>
+        </w:rPr>
+      </w:pPr>
+      <w:r>
+        <w:rPr>
+          <w:lang w:val="en-US"/>
+        </w:rPr>
+        <w:t xml:space="preserve">Three 3D fish models were sourced from the Unity Asset Store. Since the Canvas system required 2D visuals, these models were </w:t>
+      </w:r>
+      <w:r>
+        <w:rPr>
+          <w:b/>
+          <w:bCs/>
+          <w:lang w:val="en-US"/>
+        </w:rPr>
+        <w:t>converted into sprites</w:t>
+      </w:r>
+      <w:r>
+        <w:rPr>
+          <w:lang w:val="en-US"/>
+        </w:rPr>
+        <w:t xml:space="preserve"> using Blender. Renders were exported as high-resolution PNGs and imported into Unity, resulting in visually distinct and appealing UI elements for the minigame.</w:t>
+      </w:r>
+    </w:p>
+    <w:p>
+      <w:pPr>
+        <w:rPr>
+          <w:lang w:val="en-US"/>
+        </w:rPr>
+      </w:pPr>
+      <w:r>
+        <w:rPr>
+          <w:lang w:val="en-US"/>
+        </w:rPr>
+        <w:t>Fishing ponds were strategically placed across multiple islands, allowing players to access the minigame during exploration. Interaction with these ponds activated the fishing interface, smoothly transitioning players into the minigame environment.</w:t>
+      </w:r>
+    </w:p>
+    <w:p>
+      <w:pPr>
+        <w:rPr>
+          <w:b/>
+          <w:bCs/>
+          <w:lang w:val="en-US"/>
+        </w:rPr>
+      </w:pPr>
+      <w:r>
+        <w:rPr>
+          <w:b/>
+          <w:bCs/>
+          <w:lang w:val="en-US"/>
+        </w:rPr>
+        <w:t>Result</w:t>
+      </w:r>
+    </w:p>
+    <w:p>
+      <w:pPr>
+        <w:rPr>
+          <w:lang w:val="en-US"/>
+        </w:rPr>
+      </w:pPr>
+      <w:r>
+        <w:rPr>
+          <w:lang w:val="en-US"/>
+        </w:rPr>
         <w:lastRenderedPageBreak/>
-        <w:t>Fishing system</w:t>
-      </w:r>
-    </w:p>
-    <w:p>
-      <w:pPr>
-        <w:rPr>
-          <w:sz w:val="36"/>
-          <w:szCs w:val="36"/>
-          <w:u w:val="single"/>
+        <w:t>The fishing system successfully introduced an engaging and skill-based gameplay feature that complements both survival and exploration mechanics. Its transition from a 3D to a 2D interface resulted in improved performance, intuitive input, and polished visuals.</w:t>
+      </w:r>
+    </w:p>
+    <w:p>
+      <w:pPr>
+        <w:rPr>
+          <w:lang w:val="en-US"/>
+        </w:rPr>
+      </w:pPr>
+      <w:r>
+        <w:rPr>
+          <w:lang w:val="en-US"/>
+        </w:rPr>
+        <w:t xml:space="preserve">The system's tight integration with the inventory and UI provided immediate feedback, enhancing </w:t>
+      </w:r>
+      <w:proofErr w:type="gramStart"/>
+      <w:r>
+        <w:rPr>
+          <w:lang w:val="en-US"/>
+        </w:rPr>
+        <w:t>player</w:t>
+      </w:r>
+      <w:proofErr w:type="gramEnd"/>
+      <w:r>
+        <w:rPr>
+          <w:lang w:val="en-US"/>
+        </w:rPr>
+        <w:t xml:space="preserve"> agency and reinforcing a sense of progression. Real-time counters and seamless spawning mechanics ensured a smooth and satisfying gameplay loop.</w:t>
+      </w:r>
+    </w:p>
+    <w:p>
+      <w:pPr>
+        <w:rPr>
+          <w:lang w:val="en-US"/>
+        </w:rPr>
+      </w:pPr>
+      <w:r>
+        <w:rPr>
+          <w:lang w:val="en-US"/>
+        </w:rPr>
+        <w:t>Overall, the fishing minigame enriched the world with an enjoyable side activity that deepened immersion and offered strategic value, solidifying its role as a meaningful and well-integrated feature in the game’s broader design.</w:t>
+      </w:r>
+    </w:p>
+    <w:p>
+      <w:pPr>
+        <w:rPr>
           <w:lang w:val="en-US"/>
         </w:rPr>
       </w:pPr>
@@ -3901,21 +5283,7 @@
             <w:rStyle w:val="Hyperlink"/>
             <w:lang w:val="en-US"/>
           </w:rPr>
-          <w:t>thi</w:t>
-        </w:r>
-        <w:r>
-          <w:rPr>
-            <w:rStyle w:val="Hyperlink"/>
-            <w:lang w:val="en-US"/>
-          </w:rPr>
-          <w:t>s</w:t>
-        </w:r>
-        <w:r>
-          <w:rPr>
-            <w:rStyle w:val="Hyperlink"/>
-            <w:lang w:val="en-US"/>
-          </w:rPr>
-          <w:t xml:space="preserve"> video</w:t>
+          <w:t>this video</w:t>
         </w:r>
       </w:hyperlink>
       <w:r>
@@ -6704,6 +8072,155 @@
     </w:lvl>
   </w:abstractNum>
   <w:abstractNum w:abstractNumId="7" w15:restartNumberingAfterBreak="0">
+    <w:nsid w:val="4CC730CD"/>
+    <w:multiLevelType w:val="multilevel"/>
+    <w:tmpl w:val="DA2A06EE"/>
+    <w:lvl w:ilvl="0">
+      <w:start w:val="1"/>
+      <w:numFmt w:val="bullet"/>
+      <w:lvlText w:val=""/>
+      <w:lvlJc w:val="left"/>
+      <w:pPr>
+        <w:tabs>
+          <w:tab w:val="num" w:pos="720"/>
+        </w:tabs>
+        <w:ind w:left="720" w:hanging="360"/>
+      </w:pPr>
+      <w:rPr>
+        <w:rFonts w:ascii="Symbol" w:hAnsi="Symbol" w:hint="default"/>
+        <w:sz w:val="20"/>
+      </w:rPr>
+    </w:lvl>
+    <w:lvl w:ilvl="1" w:tentative="1">
+      <w:start w:val="1"/>
+      <w:numFmt w:val="bullet"/>
+      <w:lvlText w:val="o"/>
+      <w:lvlJc w:val="left"/>
+      <w:pPr>
+        <w:tabs>
+          <w:tab w:val="num" w:pos="1440"/>
+        </w:tabs>
+        <w:ind w:left="1440" w:hanging="360"/>
+      </w:pPr>
+      <w:rPr>
+        <w:rFonts w:ascii="Courier New" w:hAnsi="Courier New" w:hint="default"/>
+        <w:sz w:val="20"/>
+      </w:rPr>
+    </w:lvl>
+    <w:lvl w:ilvl="2" w:tentative="1">
+      <w:start w:val="1"/>
+      <w:numFmt w:val="bullet"/>
+      <w:lvlText w:val=""/>
+      <w:lvlJc w:val="left"/>
+      <w:pPr>
+        <w:tabs>
+          <w:tab w:val="num" w:pos="2160"/>
+        </w:tabs>
+        <w:ind w:left="2160" w:hanging="360"/>
+      </w:pPr>
+      <w:rPr>
+        <w:rFonts w:ascii="Wingdings" w:hAnsi="Wingdings" w:hint="default"/>
+        <w:sz w:val="20"/>
+      </w:rPr>
+    </w:lvl>
+    <w:lvl w:ilvl="3" w:tentative="1">
+      <w:start w:val="1"/>
+      <w:numFmt w:val="bullet"/>
+      <w:lvlText w:val=""/>
+      <w:lvlJc w:val="left"/>
+      <w:pPr>
+        <w:tabs>
+          <w:tab w:val="num" w:pos="2880"/>
+        </w:tabs>
+        <w:ind w:left="2880" w:hanging="360"/>
+      </w:pPr>
+      <w:rPr>
+        <w:rFonts w:ascii="Wingdings" w:hAnsi="Wingdings" w:hint="default"/>
+        <w:sz w:val="20"/>
+      </w:rPr>
+    </w:lvl>
+    <w:lvl w:ilvl="4" w:tentative="1">
+      <w:start w:val="1"/>
+      <w:numFmt w:val="bullet"/>
+      <w:lvlText w:val=""/>
+      <w:lvlJc w:val="left"/>
+      <w:pPr>
+        <w:tabs>
+          <w:tab w:val="num" w:pos="3600"/>
+        </w:tabs>
+        <w:ind w:left="3600" w:hanging="360"/>
+      </w:pPr>
+      <w:rPr>
+        <w:rFonts w:ascii="Wingdings" w:hAnsi="Wingdings" w:hint="default"/>
+        <w:sz w:val="20"/>
+      </w:rPr>
+    </w:lvl>
+    <w:lvl w:ilvl="5" w:tentative="1">
+      <w:start w:val="1"/>
+      <w:numFmt w:val="bullet"/>
+      <w:lvlText w:val=""/>
+      <w:lvlJc w:val="left"/>
+      <w:pPr>
+        <w:tabs>
+          <w:tab w:val="num" w:pos="4320"/>
+        </w:tabs>
+        <w:ind w:left="4320" w:hanging="360"/>
+      </w:pPr>
+      <w:rPr>
+        <w:rFonts w:ascii="Wingdings" w:hAnsi="Wingdings" w:hint="default"/>
+        <w:sz w:val="20"/>
+      </w:rPr>
+    </w:lvl>
+    <w:lvl w:ilvl="6" w:tentative="1">
+      <w:start w:val="1"/>
+      <w:numFmt w:val="bullet"/>
+      <w:lvlText w:val=""/>
+      <w:lvlJc w:val="left"/>
+      <w:pPr>
+        <w:tabs>
+          <w:tab w:val="num" w:pos="5040"/>
+        </w:tabs>
+        <w:ind w:left="5040" w:hanging="360"/>
+      </w:pPr>
+      <w:rPr>
+        <w:rFonts w:ascii="Wingdings" w:hAnsi="Wingdings" w:hint="default"/>
+        <w:sz w:val="20"/>
+      </w:rPr>
+    </w:lvl>
+    <w:lvl w:ilvl="7" w:tentative="1">
+      <w:start w:val="1"/>
+      <w:numFmt w:val="bullet"/>
+      <w:lvlText w:val=""/>
+      <w:lvlJc w:val="left"/>
+      <w:pPr>
+        <w:tabs>
+          <w:tab w:val="num" w:pos="5760"/>
+        </w:tabs>
+        <w:ind w:left="5760" w:hanging="360"/>
+      </w:pPr>
+      <w:rPr>
+        <w:rFonts w:ascii="Wingdings" w:hAnsi="Wingdings" w:hint="default"/>
+        <w:sz w:val="20"/>
+      </w:rPr>
+    </w:lvl>
+    <w:lvl w:ilvl="8" w:tentative="1">
+      <w:start w:val="1"/>
+      <w:numFmt w:val="bullet"/>
+      <w:lvlText w:val=""/>
+      <w:lvlJc w:val="left"/>
+      <w:pPr>
+        <w:tabs>
+          <w:tab w:val="num" w:pos="6480"/>
+        </w:tabs>
+        <w:ind w:left="6480" w:hanging="360"/>
+      </w:pPr>
+      <w:rPr>
+        <w:rFonts w:ascii="Wingdings" w:hAnsi="Wingdings" w:hint="default"/>
+        <w:sz w:val="20"/>
+      </w:rPr>
+    </w:lvl>
+  </w:abstractNum>
+  <w:abstractNum w:abstractNumId="8" w15:restartNumberingAfterBreak="0">
     <w:nsid w:val="4E0C6C08"/>
     <w:multiLevelType w:val="multilevel"/>
     <w:tmpl w:val="9506867E"/>
@@ -6852,7 +8369,305 @@
       </w:rPr>
     </w:lvl>
   </w:abstractNum>
-  <w:abstractNum w:abstractNumId="8" w15:restartNumberingAfterBreak="0">
+  <w:abstractNum w:abstractNumId="9" w15:restartNumberingAfterBreak="0">
+    <w:nsid w:val="5DBE7FAC"/>
+    <w:multiLevelType w:val="multilevel"/>
+    <w:tmpl w:val="83087172"/>
+    <w:lvl w:ilvl="0">
+      <w:start w:val="1"/>
+      <w:numFmt w:val="bullet"/>
+      <w:lvlText w:val=""/>
+      <w:lvlJc w:val="left"/>
+      <w:pPr>
+        <w:tabs>
+          <w:tab w:val="num" w:pos="720"/>
+        </w:tabs>
+        <w:ind w:left="720" w:hanging="360"/>
+      </w:pPr>
+      <w:rPr>
+        <w:rFonts w:ascii="Symbol" w:hAnsi="Symbol" w:hint="default"/>
+        <w:sz w:val="20"/>
+      </w:rPr>
+    </w:lvl>
+    <w:lvl w:ilvl="1" w:tentative="1">
+      <w:start w:val="1"/>
+      <w:numFmt w:val="bullet"/>
+      <w:lvlText w:val="o"/>
+      <w:lvlJc w:val="left"/>
+      <w:pPr>
+        <w:tabs>
+          <w:tab w:val="num" w:pos="1440"/>
+        </w:tabs>
+        <w:ind w:left="1440" w:hanging="360"/>
+      </w:pPr>
+      <w:rPr>
+        <w:rFonts w:ascii="Courier New" w:hAnsi="Courier New" w:hint="default"/>
+        <w:sz w:val="20"/>
+      </w:rPr>
+    </w:lvl>
+    <w:lvl w:ilvl="2" w:tentative="1">
+      <w:start w:val="1"/>
+      <w:numFmt w:val="bullet"/>
+      <w:lvlText w:val=""/>
+      <w:lvlJc w:val="left"/>
+      <w:pPr>
+        <w:tabs>
+          <w:tab w:val="num" w:pos="2160"/>
+        </w:tabs>
+        <w:ind w:left="2160" w:hanging="360"/>
+      </w:pPr>
+      <w:rPr>
+        <w:rFonts w:ascii="Wingdings" w:hAnsi="Wingdings" w:hint="default"/>
+        <w:sz w:val="20"/>
+      </w:rPr>
+    </w:lvl>
+    <w:lvl w:ilvl="3" w:tentative="1">
+      <w:start w:val="1"/>
+      <w:numFmt w:val="bullet"/>
+      <w:lvlText w:val=""/>
+      <w:lvlJc w:val="left"/>
+      <w:pPr>
+        <w:tabs>
+          <w:tab w:val="num" w:pos="2880"/>
+        </w:tabs>
+        <w:ind w:left="2880" w:hanging="360"/>
+      </w:pPr>
+      <w:rPr>
+        <w:rFonts w:ascii="Wingdings" w:hAnsi="Wingdings" w:hint="default"/>
+        <w:sz w:val="20"/>
+      </w:rPr>
+    </w:lvl>
+    <w:lvl w:ilvl="4" w:tentative="1">
+      <w:start w:val="1"/>
+      <w:numFmt w:val="bullet"/>
+      <w:lvlText w:val=""/>
+      <w:lvlJc w:val="left"/>
+      <w:pPr>
+        <w:tabs>
+          <w:tab w:val="num" w:pos="3600"/>
+        </w:tabs>
+        <w:ind w:left="3600" w:hanging="360"/>
+      </w:pPr>
+      <w:rPr>
+        <w:rFonts w:ascii="Wingdings" w:hAnsi="Wingdings" w:hint="default"/>
+        <w:sz w:val="20"/>
+      </w:rPr>
+    </w:lvl>
+    <w:lvl w:ilvl="5" w:tentative="1">
+      <w:start w:val="1"/>
+      <w:numFmt w:val="bullet"/>
+      <w:lvlText w:val=""/>
+      <w:lvlJc w:val="left"/>
+      <w:pPr>
+        <w:tabs>
+          <w:tab w:val="num" w:pos="4320"/>
+        </w:tabs>
+        <w:ind w:left="4320" w:hanging="360"/>
+      </w:pPr>
+      <w:rPr>
+        <w:rFonts w:ascii="Wingdings" w:hAnsi="Wingdings" w:hint="default"/>
+        <w:sz w:val="20"/>
+      </w:rPr>
+    </w:lvl>
+    <w:lvl w:ilvl="6" w:tentative="1">
+      <w:start w:val="1"/>
+      <w:numFmt w:val="bullet"/>
+      <w:lvlText w:val=""/>
+      <w:lvlJc w:val="left"/>
+      <w:pPr>
+        <w:tabs>
+          <w:tab w:val="num" w:pos="5040"/>
+        </w:tabs>
+        <w:ind w:left="5040" w:hanging="360"/>
+      </w:pPr>
+      <w:rPr>
+        <w:rFonts w:ascii="Wingdings" w:hAnsi="Wingdings" w:hint="default"/>
+        <w:sz w:val="20"/>
+      </w:rPr>
+    </w:lvl>
+    <w:lvl w:ilvl="7" w:tentative="1">
+      <w:start w:val="1"/>
+      <w:numFmt w:val="bullet"/>
+      <w:lvlText w:val=""/>
+      <w:lvlJc w:val="left"/>
+      <w:pPr>
+        <w:tabs>
+          <w:tab w:val="num" w:pos="5760"/>
+        </w:tabs>
+        <w:ind w:left="5760" w:hanging="360"/>
+      </w:pPr>
+      <w:rPr>
+        <w:rFonts w:ascii="Wingdings" w:hAnsi="Wingdings" w:hint="default"/>
+        <w:sz w:val="20"/>
+      </w:rPr>
+    </w:lvl>
+    <w:lvl w:ilvl="8" w:tentative="1">
+      <w:start w:val="1"/>
+      <w:numFmt w:val="bullet"/>
+      <w:lvlText w:val=""/>
+      <w:lvlJc w:val="left"/>
+      <w:pPr>
+        <w:tabs>
+          <w:tab w:val="num" w:pos="6480"/>
+        </w:tabs>
+        <w:ind w:left="6480" w:hanging="360"/>
+      </w:pPr>
+      <w:rPr>
+        <w:rFonts w:ascii="Wingdings" w:hAnsi="Wingdings" w:hint="default"/>
+        <w:sz w:val="20"/>
+      </w:rPr>
+    </w:lvl>
+  </w:abstractNum>
+  <w:abstractNum w:abstractNumId="10" w15:restartNumberingAfterBreak="0">
+    <w:nsid w:val="62C61146"/>
+    <w:multiLevelType w:val="multilevel"/>
+    <w:tmpl w:val="CF2448D8"/>
+    <w:lvl w:ilvl="0">
+      <w:start w:val="1"/>
+      <w:numFmt w:val="bullet"/>
+      <w:lvlText w:val=""/>
+      <w:lvlJc w:val="left"/>
+      <w:pPr>
+        <w:tabs>
+          <w:tab w:val="num" w:pos="720"/>
+        </w:tabs>
+        <w:ind w:left="720" w:hanging="360"/>
+      </w:pPr>
+      <w:rPr>
+        <w:rFonts w:ascii="Symbol" w:hAnsi="Symbol" w:hint="default"/>
+        <w:sz w:val="20"/>
+      </w:rPr>
+    </w:lvl>
+    <w:lvl w:ilvl="1" w:tentative="1">
+      <w:start w:val="1"/>
+      <w:numFmt w:val="bullet"/>
+      <w:lvlText w:val="o"/>
+      <w:lvlJc w:val="left"/>
+      <w:pPr>
+        <w:tabs>
+          <w:tab w:val="num" w:pos="1440"/>
+        </w:tabs>
+        <w:ind w:left="1440" w:hanging="360"/>
+      </w:pPr>
+      <w:rPr>
+        <w:rFonts w:ascii="Courier New" w:hAnsi="Courier New" w:hint="default"/>
+        <w:sz w:val="20"/>
+      </w:rPr>
+    </w:lvl>
+    <w:lvl w:ilvl="2" w:tentative="1">
+      <w:start w:val="1"/>
+      <w:numFmt w:val="bullet"/>
+      <w:lvlText w:val=""/>
+      <w:lvlJc w:val="left"/>
+      <w:pPr>
+        <w:tabs>
+          <w:tab w:val="num" w:pos="2160"/>
+        </w:tabs>
+        <w:ind w:left="2160" w:hanging="360"/>
+      </w:pPr>
+      <w:rPr>
+        <w:rFonts w:ascii="Wingdings" w:hAnsi="Wingdings" w:hint="default"/>
+        <w:sz w:val="20"/>
+      </w:rPr>
+    </w:lvl>
+    <w:lvl w:ilvl="3" w:tentative="1">
+      <w:start w:val="1"/>
+      <w:numFmt w:val="bullet"/>
+      <w:lvlText w:val=""/>
+      <w:lvlJc w:val="left"/>
+      <w:pPr>
+        <w:tabs>
+          <w:tab w:val="num" w:pos="2880"/>
+        </w:tabs>
+        <w:ind w:left="2880" w:hanging="360"/>
+      </w:pPr>
+      <w:rPr>
+        <w:rFonts w:ascii="Wingdings" w:hAnsi="Wingdings" w:hint="default"/>
+        <w:sz w:val="20"/>
+      </w:rPr>
+    </w:lvl>
+    <w:lvl w:ilvl="4" w:tentative="1">
+      <w:start w:val="1"/>
+      <w:numFmt w:val="bullet"/>
+      <w:lvlText w:val=""/>
+      <w:lvlJc w:val="left"/>
+      <w:pPr>
+        <w:tabs>
+          <w:tab w:val="num" w:pos="3600"/>
+        </w:tabs>
+        <w:ind w:left="3600" w:hanging="360"/>
+      </w:pPr>
+      <w:rPr>
+        <w:rFonts w:ascii="Wingdings" w:hAnsi="Wingdings" w:hint="default"/>
+        <w:sz w:val="20"/>
+      </w:rPr>
+    </w:lvl>
+    <w:lvl w:ilvl="5" w:tentative="1">
+      <w:start w:val="1"/>
+      <w:numFmt w:val="bullet"/>
+      <w:lvlText w:val=""/>
+      <w:lvlJc w:val="left"/>
+      <w:pPr>
+        <w:tabs>
+          <w:tab w:val="num" w:pos="4320"/>
+        </w:tabs>
+        <w:ind w:left="4320" w:hanging="360"/>
+      </w:pPr>
+      <w:rPr>
+        <w:rFonts w:ascii="Wingdings" w:hAnsi="Wingdings" w:hint="default"/>
+        <w:sz w:val="20"/>
+      </w:rPr>
+    </w:lvl>
+    <w:lvl w:ilvl="6" w:tentative="1">
+      <w:start w:val="1"/>
+      <w:numFmt w:val="bullet"/>
+      <w:lvlText w:val=""/>
+      <w:lvlJc w:val="left"/>
+      <w:pPr>
+        <w:tabs>
+          <w:tab w:val="num" w:pos="5040"/>
+        </w:tabs>
+        <w:ind w:left="5040" w:hanging="360"/>
+      </w:pPr>
+      <w:rPr>
+        <w:rFonts w:ascii="Wingdings" w:hAnsi="Wingdings" w:hint="default"/>
+        <w:sz w:val="20"/>
+      </w:rPr>
+    </w:lvl>
+    <w:lvl w:ilvl="7" w:tentative="1">
+      <w:start w:val="1"/>
+      <w:numFmt w:val="bullet"/>
+      <w:lvlText w:val=""/>
+      <w:lvlJc w:val="left"/>
+      <w:pPr>
+        <w:tabs>
+          <w:tab w:val="num" w:pos="5760"/>
+        </w:tabs>
+        <w:ind w:left="5760" w:hanging="360"/>
+      </w:pPr>
+      <w:rPr>
+        <w:rFonts w:ascii="Wingdings" w:hAnsi="Wingdings" w:hint="default"/>
+        <w:sz w:val="20"/>
+      </w:rPr>
+    </w:lvl>
+    <w:lvl w:ilvl="8" w:tentative="1">
+      <w:start w:val="1"/>
+      <w:numFmt w:val="bullet"/>
+      <w:lvlText w:val=""/>
+      <w:lvlJc w:val="left"/>
+      <w:pPr>
+        <w:tabs>
+          <w:tab w:val="num" w:pos="6480"/>
+        </w:tabs>
+        <w:ind w:left="6480" w:hanging="360"/>
+      </w:pPr>
+      <w:rPr>
+        <w:rFonts w:ascii="Wingdings" w:hAnsi="Wingdings" w:hint="default"/>
+        <w:sz w:val="20"/>
+      </w:rPr>
+    </w:lvl>
+  </w:abstractNum>
+  <w:abstractNum w:abstractNumId="11" w15:restartNumberingAfterBreak="0">
     <w:nsid w:val="64740F83"/>
     <w:multiLevelType w:val="multilevel"/>
     <w:tmpl w:val="7A824DD2"/>
@@ -7001,7 +8816,156 @@
       </w:rPr>
     </w:lvl>
   </w:abstractNum>
-  <w:abstractNum w:abstractNumId="9" w15:restartNumberingAfterBreak="0">
+  <w:abstractNum w:abstractNumId="12" w15:restartNumberingAfterBreak="0">
+    <w:nsid w:val="661A3B91"/>
+    <w:multiLevelType w:val="multilevel"/>
+    <w:tmpl w:val="D4508EFC"/>
+    <w:lvl w:ilvl="0">
+      <w:start w:val="1"/>
+      <w:numFmt w:val="bullet"/>
+      <w:lvlText w:val=""/>
+      <w:lvlJc w:val="left"/>
+      <w:pPr>
+        <w:tabs>
+          <w:tab w:val="num" w:pos="720"/>
+        </w:tabs>
+        <w:ind w:left="720" w:hanging="360"/>
+      </w:pPr>
+      <w:rPr>
+        <w:rFonts w:ascii="Symbol" w:hAnsi="Symbol" w:hint="default"/>
+        <w:sz w:val="20"/>
+      </w:rPr>
+    </w:lvl>
+    <w:lvl w:ilvl="1" w:tentative="1">
+      <w:start w:val="1"/>
+      <w:numFmt w:val="bullet"/>
+      <w:lvlText w:val="o"/>
+      <w:lvlJc w:val="left"/>
+      <w:pPr>
+        <w:tabs>
+          <w:tab w:val="num" w:pos="1440"/>
+        </w:tabs>
+        <w:ind w:left="1440" w:hanging="360"/>
+      </w:pPr>
+      <w:rPr>
+        <w:rFonts w:ascii="Courier New" w:hAnsi="Courier New" w:hint="default"/>
+        <w:sz w:val="20"/>
+      </w:rPr>
+    </w:lvl>
+    <w:lvl w:ilvl="2" w:tentative="1">
+      <w:start w:val="1"/>
+      <w:numFmt w:val="bullet"/>
+      <w:lvlText w:val=""/>
+      <w:lvlJc w:val="left"/>
+      <w:pPr>
+        <w:tabs>
+          <w:tab w:val="num" w:pos="2160"/>
+        </w:tabs>
+        <w:ind w:left="2160" w:hanging="360"/>
+      </w:pPr>
+      <w:rPr>
+        <w:rFonts w:ascii="Wingdings" w:hAnsi="Wingdings" w:hint="default"/>
+        <w:sz w:val="20"/>
+      </w:rPr>
+    </w:lvl>
+    <w:lvl w:ilvl="3" w:tentative="1">
+      <w:start w:val="1"/>
+      <w:numFmt w:val="bullet"/>
+      <w:lvlText w:val=""/>
+      <w:lvlJc w:val="left"/>
+      <w:pPr>
+        <w:tabs>
+          <w:tab w:val="num" w:pos="2880"/>
+        </w:tabs>
+        <w:ind w:left="2880" w:hanging="360"/>
+      </w:pPr>
+      <w:rPr>
+        <w:rFonts w:ascii="Wingdings" w:hAnsi="Wingdings" w:hint="default"/>
+        <w:sz w:val="20"/>
+      </w:rPr>
+    </w:lvl>
+    <w:lvl w:ilvl="4" w:tentative="1">
+      <w:start w:val="1"/>
+      <w:numFmt w:val="bullet"/>
+      <w:lvlText w:val=""/>
+      <w:lvlJc w:val="left"/>
+      <w:pPr>
+        <w:tabs>
+          <w:tab w:val="num" w:pos="3600"/>
+        </w:tabs>
+        <w:ind w:left="3600" w:hanging="360"/>
+      </w:pPr>
+      <w:rPr>
+        <w:rFonts w:ascii="Wingdings" w:hAnsi="Wingdings" w:hint="default"/>
+        <w:sz w:val="20"/>
+      </w:rPr>
+    </w:lvl>
+    <w:lvl w:ilvl="5" w:tentative="1">
+      <w:start w:val="1"/>
+      <w:numFmt w:val="bullet"/>
+      <w:lvlText w:val=""/>
+      <w:lvlJc w:val="left"/>
+      <w:pPr>
+        <w:tabs>
+          <w:tab w:val="num" w:pos="4320"/>
+        </w:tabs>
+        <w:ind w:left="4320" w:hanging="360"/>
+      </w:pPr>
+      <w:rPr>
+        <w:rFonts w:ascii="Wingdings" w:hAnsi="Wingdings" w:hint="default"/>
+        <w:sz w:val="20"/>
+      </w:rPr>
+    </w:lvl>
+    <w:lvl w:ilvl="6" w:tentative="1">
+      <w:start w:val="1"/>
+      <w:numFmt w:val="bullet"/>
+      <w:lvlText w:val=""/>
+      <w:lvlJc w:val="left"/>
+      <w:pPr>
+        <w:tabs>
+          <w:tab w:val="num" w:pos="5040"/>
+        </w:tabs>
+        <w:ind w:left="5040" w:hanging="360"/>
+      </w:pPr>
+      <w:rPr>
+        <w:rFonts w:ascii="Wingdings" w:hAnsi="Wingdings" w:hint="default"/>
+        <w:sz w:val="20"/>
+      </w:rPr>
+    </w:lvl>
+    <w:lvl w:ilvl="7" w:tentative="1">
+      <w:start w:val="1"/>
+      <w:numFmt w:val="bullet"/>
+      <w:lvlText w:val=""/>
+      <w:lvlJc w:val="left"/>
+      <w:pPr>
+        <w:tabs>
+          <w:tab w:val="num" w:pos="5760"/>
+        </w:tabs>
+        <w:ind w:left="5760" w:hanging="360"/>
+      </w:pPr>
+      <w:rPr>
+        <w:rFonts w:ascii="Wingdings" w:hAnsi="Wingdings" w:hint="default"/>
+        <w:sz w:val="20"/>
+      </w:rPr>
+    </w:lvl>
+    <w:lvl w:ilvl="8" w:tentative="1">
+      <w:start w:val="1"/>
+      <w:numFmt w:val="bullet"/>
+      <w:lvlText w:val=""/>
+      <w:lvlJc w:val="left"/>
+      <w:pPr>
+        <w:tabs>
+          <w:tab w:val="num" w:pos="6480"/>
+        </w:tabs>
+        <w:ind w:left="6480" w:hanging="360"/>
+      </w:pPr>
+      <w:rPr>
+        <w:rFonts w:ascii="Wingdings" w:hAnsi="Wingdings" w:hint="default"/>
+        <w:sz w:val="20"/>
+      </w:rPr>
+    </w:lvl>
+  </w:abstractNum>
+  <w:abstractNum w:abstractNumId="13" w15:restartNumberingAfterBreak="0">
     <w:nsid w:val="66E82693"/>
     <w:multiLevelType w:val="multilevel"/>
     <w:tmpl w:val="443889FE"/>
@@ -7150,7 +9114,7 @@
       </w:rPr>
     </w:lvl>
   </w:abstractNum>
-  <w:abstractNum w:abstractNumId="10" w15:restartNumberingAfterBreak="0">
+  <w:abstractNum w:abstractNumId="14" w15:restartNumberingAfterBreak="0">
     <w:nsid w:val="6DBF7F8E"/>
     <w:multiLevelType w:val="multilevel"/>
     <w:tmpl w:val="7B6C7054"/>
@@ -7299,7 +9263,7 @@
       </w:rPr>
     </w:lvl>
   </w:abstractNum>
-  <w:abstractNum w:abstractNumId="11" w15:restartNumberingAfterBreak="0">
+  <w:abstractNum w:abstractNumId="15" w15:restartNumberingAfterBreak="0">
     <w:nsid w:val="70356058"/>
     <w:multiLevelType w:val="multilevel"/>
     <w:tmpl w:val="9EFEEACE"/>
@@ -7448,7 +9412,7 @@
       </w:rPr>
     </w:lvl>
   </w:abstractNum>
-  <w:abstractNum w:abstractNumId="12" w15:restartNumberingAfterBreak="0">
+  <w:abstractNum w:abstractNumId="16" w15:restartNumberingAfterBreak="0">
     <w:nsid w:val="74ED0413"/>
     <w:multiLevelType w:val="multilevel"/>
     <w:tmpl w:val="1B8051DC"/>
@@ -7561,7 +9525,7 @@
       </w:pPr>
     </w:lvl>
   </w:abstractNum>
-  <w:abstractNum w:abstractNumId="13" w15:restartNumberingAfterBreak="0">
+  <w:abstractNum w:abstractNumId="17" w15:restartNumberingAfterBreak="0">
     <w:nsid w:val="75C006B2"/>
     <w:multiLevelType w:val="multilevel"/>
     <w:tmpl w:val="3B664762"/>
@@ -7710,7 +9674,7 @@
       </w:rPr>
     </w:lvl>
   </w:abstractNum>
-  <w:abstractNum w:abstractNumId="14" w15:restartNumberingAfterBreak="0">
+  <w:abstractNum w:abstractNumId="18" w15:restartNumberingAfterBreak="0">
     <w:nsid w:val="7F035AC9"/>
     <w:multiLevelType w:val="multilevel"/>
     <w:tmpl w:val="591C1D36"/>
@@ -7863,13 +9827,13 @@
     <w:abstractNumId w:val="2"/>
   </w:num>
   <w:num w:numId="2" w16cid:durableId="1612275815">
-    <w:abstractNumId w:val="10"/>
+    <w:abstractNumId w:val="14"/>
   </w:num>
   <w:num w:numId="3" w16cid:durableId="1957758695">
     <w:abstractNumId w:val="3"/>
   </w:num>
   <w:num w:numId="4" w16cid:durableId="2008365142">
-    <w:abstractNumId w:val="13"/>
+    <w:abstractNumId w:val="17"/>
   </w:num>
   <w:num w:numId="5" w16cid:durableId="863446606">
     <w:abstractNumId w:val="1"/>
@@ -7878,31 +9842,43 @@
     <w:abstractNumId w:val="5"/>
   </w:num>
   <w:num w:numId="7" w16cid:durableId="2027293402">
-    <w:abstractNumId w:val="8"/>
+    <w:abstractNumId w:val="11"/>
   </w:num>
   <w:num w:numId="8" w16cid:durableId="1712655583">
     <w:abstractNumId w:val="6"/>
   </w:num>
   <w:num w:numId="9" w16cid:durableId="1912694652">
-    <w:abstractNumId w:val="12"/>
+    <w:abstractNumId w:val="16"/>
   </w:num>
   <w:num w:numId="10" w16cid:durableId="1553927216">
     <w:abstractNumId w:val="4"/>
   </w:num>
   <w:num w:numId="11" w16cid:durableId="1945335712">
-    <w:abstractNumId w:val="14"/>
+    <w:abstractNumId w:val="18"/>
   </w:num>
   <w:num w:numId="12" w16cid:durableId="334456724">
     <w:abstractNumId w:val="0"/>
   </w:num>
   <w:num w:numId="13" w16cid:durableId="22676919">
+    <w:abstractNumId w:val="8"/>
+  </w:num>
+  <w:num w:numId="14" w16cid:durableId="929313436">
+    <w:abstractNumId w:val="13"/>
+  </w:num>
+  <w:num w:numId="15" w16cid:durableId="1392004153">
+    <w:abstractNumId w:val="15"/>
+  </w:num>
+  <w:num w:numId="16" w16cid:durableId="1336570052">
+    <w:abstractNumId w:val="9"/>
+  </w:num>
+  <w:num w:numId="17" w16cid:durableId="2043433720">
+    <w:abstractNumId w:val="10"/>
+  </w:num>
+  <w:num w:numId="18" w16cid:durableId="520320387">
     <w:abstractNumId w:val="7"/>
   </w:num>
-  <w:num w:numId="14" w16cid:durableId="929313436">
-    <w:abstractNumId w:val="9"/>
-  </w:num>
-  <w:num w:numId="15" w16cid:durableId="1392004153">
-    <w:abstractNumId w:val="11"/>
+  <w:num w:numId="19" w16cid:durableId="39017208">
+    <w:abstractNumId w:val="12"/>
   </w:num>
 </w:numbering>
 </file>

</xml_diff>

<commit_message>
UserManual Update & Report illustration added
</commit_message>
<xml_diff>
--- a/Soutenance28-05/Report/Defense.docx
+++ b/Soutenance28-05/Report/Defense.docx
@@ -6250,17 +6250,13 @@
         </w:rPr>
         <w:t>Objective</w:t>
       </w:r>
-    </w:p>
-    <w:p>
-      <w:pPr>
-        <w:rPr>
-          <w:lang w:val="en-US"/>
-        </w:rPr>
-      </w:pPr>
-      <w:r>
-        <w:rPr>
-          <w:lang w:val="en-US"/>
-        </w:rPr>
+      <w:r>
+        <w:rPr>
+          <w:b/>
+          <w:bCs/>
+          <w:lang w:val="en-US"/>
+        </w:rPr>
+        <w:br/>
         <w:t>The primary objective was to resolve a visual issue in the first-person camera system where players could see unintended parts of their own character model, such as legs and internal geometry. This broke immersion and disrupted the intended gameplay experience. The goal was to make the player’s character invisible from their own camera while ensuring the model remained fully visible to other players in a multiplayer environment. Addressing this was essential for maintaining visual realism and consistency.</w:t>
       </w:r>
     </w:p>
@@ -6278,60 +6274,122 @@
           <w:bCs/>
           <w:lang w:val="en-US"/>
         </w:rPr>
-        <w:t>Technical Implementation</w:t>
-      </w:r>
-    </w:p>
-    <w:p>
-      <w:pPr>
-        <w:rPr>
-          <w:lang w:val="en-US"/>
-        </w:rPr>
-      </w:pPr>
-      <w:r>
-        <w:rPr>
-          <w:lang w:val="en-US"/>
-        </w:rPr>
-        <w:t>The issue stemmed from the visibility of the character model’s internal textures when viewed from a first-person perspective. Initial efforts to resolve the problem by adjusting the Mesh Renderer directly in Unity were blocked, as the Mesh Renderer component was not exposed in the Inspector for the current model. To work around this limitation, a duplicate of the player model was created—one with a visible and accessible Mesh Renderer—enabling full material control.</w:t>
-      </w:r>
-    </w:p>
-    <w:p>
-      <w:pPr>
-        <w:rPr>
-          <w:lang w:val="en-US"/>
-        </w:rPr>
-      </w:pPr>
-      <w:r>
-        <w:rPr>
-          <w:lang w:val="en-US"/>
-        </w:rPr>
-        <w:t xml:space="preserve">To ensure visual consistency, the original albedo texture (color texture) was extracted from </w:t>
-      </w:r>
-      <w:proofErr w:type="gramStart"/>
-      <w:r>
-        <w:rPr>
-          <w:lang w:val="en-US"/>
-        </w:rPr>
-        <w:t>the .</w:t>
+        <w:t xml:space="preserve">The </w:t>
       </w:r>
       <w:proofErr w:type="spellStart"/>
       <w:r>
         <w:rPr>
-          <w:lang w:val="en-US"/>
-        </w:rPr>
-        <w:t>fbx</w:t>
+          <w:b/>
+          <w:bCs/>
+          <w:lang w:val="en-US"/>
+        </w:rPr>
+        <w:t>objectfive</w:t>
       </w:r>
       <w:proofErr w:type="spellEnd"/>
-      <w:proofErr w:type="gramEnd"/>
-      <w:r>
-        <w:rPr>
-          <w:lang w:val="en-US"/>
-        </w:rPr>
-        <w:t xml:space="preserve"> model using Blender. A publicly available tutorial guided the texture extraction process (</w:t>
-      </w:r>
-      <w:hyperlink r:id="rId6" w:history="1">
+      <w:r>
+        <w:rPr>
+          <w:b/>
+          <w:bCs/>
+          <w:lang w:val="en-US"/>
+        </w:rPr>
+        <w:t xml:space="preserve"> was to find humanoid entities to implement them in the game for the player—the passive and offensive NPCs including terrestrial and maritime enemies. Some entities were found on </w:t>
+      </w:r>
+      <w:hyperlink r:id="rId6" w:tgtFrame="_new" w:history="1">
         <w:r>
           <w:rPr>
             <w:rStyle w:val="Hyperlink"/>
+            <w:b/>
+            <w:bCs/>
+            <w:lang w:val="en-US"/>
+          </w:rPr>
+          <w:t>https://poly.pizza</w:t>
+        </w:r>
+      </w:hyperlink>
+      <w:r>
+        <w:rPr>
+          <w:b/>
+          <w:bCs/>
+          <w:lang w:val="en-US"/>
+        </w:rPr>
+        <w:t xml:space="preserve"> and others were found on Unity’s Asset Store, especially for the passive NPCs, which is very useful for the diversity of NPCs in the village. And on Unity’s Asset Store libraries, we are sure to have the 3D model rigged, which was very practical for the animation.</w:t>
+      </w:r>
+    </w:p>
+    <w:p>
+      <w:pPr>
+        <w:rPr>
+          <w:b/>
+          <w:bCs/>
+          <w:lang w:val="en-US"/>
+        </w:rPr>
+      </w:pPr>
+      <w:r>
+        <w:rPr>
+          <w:b/>
+          <w:bCs/>
+          <w:lang w:val="en-US"/>
+        </w:rPr>
+        <w:t>Technical Implementation</w:t>
+      </w:r>
+      <w:r>
+        <w:rPr>
+          <w:b/>
+          <w:bCs/>
+          <w:lang w:val="en-US"/>
+        </w:rPr>
+        <w:br/>
+        <w:t>The issue stemmed from the visibility of the character model’s internal textures when viewed from a first-person perspective. Initial efforts to resolve the problem by adjusting the Mesh Renderer directly in Unity were blocked, as the Mesh Renderer component was not exposed in the Inspector for the current model. To work around this limitation, a duplicate of the player model was created—one with a visible and accessible Mesh Renderer—enabling full material control.</w:t>
+      </w:r>
+    </w:p>
+    <w:p>
+      <w:pPr>
+        <w:rPr>
+          <w:b/>
+          <w:bCs/>
+          <w:lang w:val="en-US"/>
+        </w:rPr>
+      </w:pPr>
+      <w:r>
+        <w:rPr>
+          <w:b/>
+          <w:bCs/>
+          <w:lang w:val="en-US"/>
+        </w:rPr>
+        <w:t xml:space="preserve">To ensure visual consistency, the original albedo texture (color texture) was extracted from </w:t>
+      </w:r>
+      <w:proofErr w:type="gramStart"/>
+      <w:r>
+        <w:rPr>
+          <w:b/>
+          <w:bCs/>
+          <w:lang w:val="en-US"/>
+        </w:rPr>
+        <w:t>the .</w:t>
+      </w:r>
+      <w:proofErr w:type="spellStart"/>
+      <w:r>
+        <w:rPr>
+          <w:b/>
+          <w:bCs/>
+          <w:lang w:val="en-US"/>
+        </w:rPr>
+        <w:t>fbx</w:t>
+      </w:r>
+      <w:proofErr w:type="spellEnd"/>
+      <w:proofErr w:type="gramEnd"/>
+      <w:r>
+        <w:rPr>
+          <w:b/>
+          <w:bCs/>
+          <w:lang w:val="en-US"/>
+        </w:rPr>
+        <w:t xml:space="preserve"> model using Blender. A publicly available tutorial guided the texture extraction process (</w:t>
+      </w:r>
+      <w:hyperlink r:id="rId7" w:tgtFrame="_new" w:history="1">
+        <w:r>
+          <w:rPr>
+            <w:rStyle w:val="Hyperlink"/>
+            <w:b/>
+            <w:bCs/>
             <w:lang w:val="en-US"/>
           </w:rPr>
           <w:t>https://youtu.be/wG6ON8wZYLc</w:t>
@@ -6339,6 +6397,8 @@
       </w:hyperlink>
       <w:r>
         <w:rPr>
+          <w:b/>
+          <w:bCs/>
           <w:lang w:val="en-US"/>
         </w:rPr>
         <w:t>), ensuring it was cleanly exported as a .</w:t>
@@ -6346,6 +6406,8 @@
       <w:proofErr w:type="spellStart"/>
       <w:r>
         <w:rPr>
+          <w:b/>
+          <w:bCs/>
           <w:lang w:val="en-US"/>
         </w:rPr>
         <w:t>png</w:t>
@@ -6353,6 +6415,8 @@
       <w:proofErr w:type="spellEnd"/>
       <w:r>
         <w:rPr>
+          <w:b/>
+          <w:bCs/>
           <w:lang w:val="en-US"/>
         </w:rPr>
         <w:t xml:space="preserve"> file suitable for Unity.</w:t>
@@ -6361,24 +6425,40 @@
     <w:p>
       <w:pPr>
         <w:rPr>
-          <w:lang w:val="en-US"/>
-        </w:rPr>
-      </w:pPr>
-      <w:r>
-        <w:rPr>
-          <w:lang w:val="en-US"/>
-        </w:rPr>
-        <w:t>Once extracted, the texture was applied to the duplicate model in Unity. A custom invisible material was then created using a transparent shader to make the model invisible when viewed from the local player's camera. With the invisible material working, a script was developed to handle dynamic visibility switching. This script toggled materials based on camera state, ensuring that the model became invisible only in the local first-person view while remaining visible to other players in the game.</w:t>
-      </w:r>
-    </w:p>
-    <w:p>
-      <w:pPr>
-        <w:rPr>
-          <w:lang w:val="en-US"/>
-        </w:rPr>
-      </w:pPr>
-      <w:r>
-        <w:rPr>
+          <w:b/>
+          <w:bCs/>
+          <w:lang w:val="en-US"/>
+        </w:rPr>
+      </w:pPr>
+      <w:r>
+        <w:rPr>
+          <w:b/>
+          <w:bCs/>
+          <w:lang w:val="en-US"/>
+        </w:rPr>
+        <w:t>Once extracted, the texture was applied to the duplicate model in Unity</w:t>
+      </w:r>
+      <w:r>
+        <w:rPr>
+          <w:b/>
+          <w:bCs/>
+          <w:lang w:val="en-US"/>
+        </w:rPr>
+        <w:t>.</w:t>
+      </w:r>
+    </w:p>
+    <w:p>
+      <w:pPr>
+        <w:rPr>
+          <w:b/>
+          <w:bCs/>
+          <w:lang w:val="en-US"/>
+        </w:rPr>
+      </w:pPr>
+      <w:r>
+        <w:rPr>
+          <w:b/>
+          <w:bCs/>
           <w:lang w:val="en-US"/>
         </w:rPr>
         <w:t>During the animation testing phase, it was observed that the player’s own texture, including elements such as the leg, was visible through the first-person camera. This visibility of the internal texture created an unrealistic and immersion-breaking effect. The core issue was that the player could see the inside of the 3D model’s texture from their own perspective. The objective was to develop a solution that would hide the player’s texture exclusively from their own camera view, while maintaining full visibility of the player’s model for other participants in a multiplayer environment. Addressing this was critical to preserving immersion and realism during gameplay.</w:t>
@@ -6387,26 +6467,26 @@
     <w:p>
       <w:pPr>
         <w:rPr>
-          <w:lang w:val="en-US"/>
-        </w:rPr>
-      </w:pPr>
-      <w:r>
-        <w:rPr>
+          <w:b/>
+          <w:bCs/>
+          <w:lang w:val="en-US"/>
+        </w:rPr>
+      </w:pPr>
+      <w:r>
+        <w:rPr>
+          <w:b/>
+          <w:bCs/>
           <w:lang w:val="en-US"/>
         </w:rPr>
         <w:t>One approach involved moving the camera on the player prefab by a very small distance to mitigate the visibility issue.</w:t>
       </w:r>
-    </w:p>
-    <w:p>
-      <w:pPr>
-        <w:rPr>
-          <w:lang w:val="en-US"/>
-        </w:rPr>
-      </w:pPr>
-      <w:r>
-        <w:rPr>
-          <w:lang w:val="en-US"/>
-        </w:rPr>
+      <w:r>
+        <w:rPr>
+          <w:b/>
+          <w:bCs/>
+          <w:lang w:val="en-US"/>
+        </w:rPr>
+        <w:br/>
         <w:t>This system allowed seamless control of visibility without affecting the integrity of the multiplayer environment.</w:t>
       </w:r>
     </w:p>
@@ -6426,48 +6506,74 @@
         </w:rPr>
         <w:t>Result</w:t>
       </w:r>
-    </w:p>
-    <w:p>
-      <w:pPr>
-        <w:rPr>
-          <w:lang w:val="en-US"/>
-        </w:rPr>
-      </w:pPr>
-      <w:r>
-        <w:rPr>
-          <w:lang w:val="en-US"/>
-        </w:rPr>
+      <w:r>
+        <w:rPr>
+          <w:b/>
+          <w:bCs/>
+          <w:lang w:val="en-US"/>
+        </w:rPr>
+        <w:br/>
         <w:t>The final implementation effectively resolved the immersion-breaking issue. By combining Blender-based texture extraction, Unity material management, and a custom scripting system, the local player no longer saw their own character model in first-person mode. The model remained fully visible to other players, preserving multiplayer functionality.</w:t>
       </w:r>
     </w:p>
     <w:p>
       <w:pPr>
         <w:rPr>
-          <w:lang w:val="en-US"/>
-        </w:rPr>
-      </w:pPr>
-      <w:r>
-        <w:rPr>
-          <w:lang w:val="en-US"/>
-        </w:rPr>
-        <w:t xml:space="preserve">The solution significantly enhanced the visual and immersive quality of the gameplay experience. Despite requiring coordination between Blender and Unity and a multi-step process, the result was a </w:t>
-      </w:r>
-      <w:r>
-        <w:rPr>
+          <w:b/>
+          <w:bCs/>
+          <w:lang w:val="en-US"/>
+        </w:rPr>
+      </w:pPr>
+      <w:r>
+        <w:rPr>
+          <w:b/>
+          <w:bCs/>
+          <w:lang w:val="en-US"/>
+        </w:rPr>
+        <w:t xml:space="preserve">The solution significantly enhanced the visual and immersive quality of the gameplay experience. Despite requiring coordination between Blender and Unity and a multi-step process, the result was </w:t>
+      </w:r>
+      <w:r>
+        <w:rPr>
+          <w:b/>
+          <w:bCs/>
           <w:lang w:val="en-US"/>
         </w:rPr>
         <w:lastRenderedPageBreak/>
-        <w:t>robust and scalable system. The project achieved its goal of improving realism without compromising multiplayer integrity.</w:t>
-      </w:r>
-    </w:p>
-    <w:p>
-      <w:pPr>
-        <w:rPr>
-          <w:lang w:val="en-US"/>
-        </w:rPr>
-      </w:pPr>
-      <w:r>
-        <w:rPr>
+        <w:t>a robust and scalable system. The project achieved its goal of improving realism without compromising multiplayer integrity.</w:t>
+      </w:r>
+    </w:p>
+    <w:p>
+      <w:pPr>
+        <w:rPr>
+          <w:lang w:val="en-US"/>
+        </w:rPr>
+      </w:pPr>
+    </w:p>
+    <w:p>
+      <w:pPr>
+        <w:rPr>
+          <w:lang w:val="en-US"/>
+        </w:rPr>
+      </w:pPr>
+    </w:p>
+    <w:p>
+      <w:pPr>
+        <w:rPr>
+          <w:b/>
+          <w:bCs/>
+          <w:sz w:val="36"/>
+          <w:szCs w:val="36"/>
+          <w:u w:val="single"/>
+          <w:lang w:val="en-US"/>
+        </w:rPr>
+      </w:pPr>
+      <w:r>
+        <w:rPr>
+          <w:b/>
+          <w:bCs/>
+          <w:sz w:val="36"/>
+          <w:szCs w:val="36"/>
+          <w:u w:val="single"/>
           <w:lang w:val="en-US"/>
         </w:rPr>
         <w:br w:type="page"/>
@@ -6567,7 +6673,7 @@
           <w:lang w:val="en-US"/>
         </w:rPr>
       </w:pPr>
-      <w:hyperlink r:id="rId7" w:history="1">
+      <w:hyperlink r:id="rId8" w:history="1">
         <w:r>
           <w:rPr>
             <w:rStyle w:val="Hyperlink"/>
@@ -6593,7 +6699,7 @@
           <w:lang w:val="en-US"/>
         </w:rPr>
       </w:pPr>
-      <w:hyperlink r:id="rId8" w:history="1">
+      <w:hyperlink r:id="rId9" w:history="1">
         <w:r>
           <w:rPr>
             <w:rStyle w:val="Hyperlink"/>
@@ -6619,7 +6725,7 @@
           <w:lang w:val="en-US"/>
         </w:rPr>
       </w:pPr>
-      <w:hyperlink r:id="rId9" w:history="1">
+      <w:hyperlink r:id="rId10" w:history="1">
         <w:r>
           <w:rPr>
             <w:rStyle w:val="Hyperlink"/>
@@ -6661,7 +6767,7 @@
         </w:rPr>
         <w:t xml:space="preserve"> (</w:t>
       </w:r>
-      <w:hyperlink r:id="rId10" w:tgtFrame="_new" w:history="1">
+      <w:hyperlink r:id="rId11" w:tgtFrame="_new" w:history="1">
         <w:r>
           <w:rPr>
             <w:rStyle w:val="Hyperlink"/>
@@ -6689,7 +6795,7 @@
         </w:rPr>
         <w:t>Early attempts to apply these animations in Unity revealed the player model lacked a skeleton, preventing proper animation. Attempts to rig the model directly in Unity failed repeatedly. The solution was to rig the player model externally in Blender, guided by a tutorial (</w:t>
       </w:r>
-      <w:hyperlink r:id="rId11" w:tgtFrame="_new" w:history="1">
+      <w:hyperlink r:id="rId12" w:tgtFrame="_new" w:history="1">
         <w:r>
           <w:rPr>
             <w:rStyle w:val="Hyperlink"/>
@@ -6730,7 +6836,7 @@
         </w:rPr>
         <w:t>Special focus was given to jump and fall animations to make them responsive to varying jump heights and fall distances. This was accomplished with help from a tutorial on dynamic jump and fall behavior (</w:t>
       </w:r>
-      <w:hyperlink r:id="rId12" w:tgtFrame="_new" w:history="1">
+      <w:hyperlink r:id="rId13" w:tgtFrame="_new" w:history="1">
         <w:r>
           <w:rPr>
             <w:rStyle w:val="Hyperlink"/>

</xml_diff>

<commit_message>
Appendix & Multiplayer added to report
</commit_message>
<xml_diff>
--- a/Soutenance28-05/Report/Defense.docx
+++ b/Soutenance28-05/Report/Defense.docx
@@ -5597,11 +5597,477 @@
     <w:p>
       <w:pPr>
         <w:rPr>
-          <w:lang w:val="en-US"/>
-        </w:rPr>
-      </w:pPr>
-      <w:r>
-        <w:rPr>
+          <w:b/>
+          <w:bCs/>
+          <w:lang w:val="en-US"/>
+        </w:rPr>
+      </w:pPr>
+      <w:r>
+        <w:rPr>
+          <w:b/>
+          <w:bCs/>
+          <w:lang w:val="en-US"/>
+        </w:rPr>
+        <w:t>Objectives</w:t>
+      </w:r>
+    </w:p>
+    <w:p>
+      <w:pPr>
+        <w:rPr>
+          <w:b/>
+          <w:bCs/>
+          <w:lang w:val="en-US"/>
+        </w:rPr>
+      </w:pPr>
+      <w:r>
+        <w:rPr>
+          <w:b/>
+          <w:bCs/>
+          <w:lang w:val="en-US"/>
+        </w:rPr>
+        <w:t xml:space="preserve">The addition of multiplayer functionality aimed </w:t>
+      </w:r>
+      <w:proofErr w:type="gramStart"/>
+      <w:r>
+        <w:rPr>
+          <w:b/>
+          <w:bCs/>
+          <w:lang w:val="en-US"/>
+        </w:rPr>
+        <w:t>to expand</w:t>
+      </w:r>
+      <w:proofErr w:type="gramEnd"/>
+      <w:r>
+        <w:rPr>
+          <w:b/>
+          <w:bCs/>
+          <w:lang w:val="en-US"/>
+        </w:rPr>
+        <w:t xml:space="preserve"> the game experience by introducing new ways for players to engage with one another. Two </w:t>
+      </w:r>
+      <w:proofErr w:type="gramStart"/>
+      <w:r>
+        <w:rPr>
+          <w:b/>
+          <w:bCs/>
+          <w:lang w:val="en-US"/>
+        </w:rPr>
+        <w:t>mini-games</w:t>
+      </w:r>
+      <w:proofErr w:type="gramEnd"/>
+      <w:r>
+        <w:rPr>
+          <w:b/>
+          <w:bCs/>
+          <w:lang w:val="en-US"/>
+        </w:rPr>
+        <w:t xml:space="preserve"> were designed as optional multiplayer activities: a treasure hunt and a boat race. Both were inspired by pirate folklore and seafaring traditions, reinforcing the game’s theme while offering exciting, social gameplay moments.</w:t>
+      </w:r>
+    </w:p>
+    <w:p>
+      <w:pPr>
+        <w:rPr>
+          <w:b/>
+          <w:bCs/>
+          <w:lang w:val="en-US"/>
+        </w:rPr>
+      </w:pPr>
+      <w:r>
+        <w:rPr>
+          <w:b/>
+          <w:bCs/>
+          <w:lang w:val="en-US"/>
+        </w:rPr>
+        <w:t xml:space="preserve">The treasure hunt mode encourages exploration and competitive discovery, where players race to find a hidden chest. Meanwhile, the boat race reflects the naval prowess of pirates, challenging players to navigate a marked course in a test of speed and control. Together, these modes were conceived to add variety, </w:t>
+      </w:r>
+      <w:proofErr w:type="spellStart"/>
+      <w:r>
+        <w:rPr>
+          <w:b/>
+          <w:bCs/>
+          <w:lang w:val="en-US"/>
+        </w:rPr>
+        <w:t>replayability</w:t>
+      </w:r>
+      <w:proofErr w:type="spellEnd"/>
+      <w:r>
+        <w:rPr>
+          <w:b/>
+          <w:bCs/>
+          <w:lang w:val="en-US"/>
+        </w:rPr>
+        <w:t>, and a sense of camaraderie or rivalry to the game.</w:t>
+      </w:r>
+    </w:p>
+    <w:p>
+      <w:pPr>
+        <w:rPr>
+          <w:b/>
+          <w:bCs/>
+          <w:lang w:val="en-US"/>
+        </w:rPr>
+      </w:pPr>
+      <w:r>
+        <w:rPr>
+          <w:b/>
+          <w:bCs/>
+          <w:lang w:val="en-US"/>
+        </w:rPr>
+        <w:t>Implementation</w:t>
+      </w:r>
+    </w:p>
+    <w:p>
+      <w:pPr>
+        <w:rPr>
+          <w:b/>
+          <w:bCs/>
+          <w:lang w:val="en-US"/>
+        </w:rPr>
+      </w:pPr>
+      <w:r>
+        <w:rPr>
+          <w:b/>
+          <w:bCs/>
+          <w:lang w:val="en-US"/>
+        </w:rPr>
+        <w:t xml:space="preserve">Multiplayer integration was achieved using Unity’s </w:t>
+      </w:r>
+      <w:proofErr w:type="spellStart"/>
+      <w:r>
+        <w:rPr>
+          <w:b/>
+          <w:bCs/>
+          <w:lang w:val="en-US"/>
+        </w:rPr>
+        <w:t>Netcode</w:t>
+      </w:r>
+      <w:proofErr w:type="spellEnd"/>
+      <w:r>
+        <w:rPr>
+          <w:b/>
+          <w:bCs/>
+          <w:lang w:val="en-US"/>
+        </w:rPr>
+        <w:t xml:space="preserve"> for </w:t>
+      </w:r>
+      <w:proofErr w:type="spellStart"/>
+      <w:r>
+        <w:rPr>
+          <w:b/>
+          <w:bCs/>
+          <w:lang w:val="en-US"/>
+        </w:rPr>
+        <w:t>GameObjects</w:t>
+      </w:r>
+      <w:proofErr w:type="spellEnd"/>
+      <w:r>
+        <w:rPr>
+          <w:b/>
+          <w:bCs/>
+          <w:lang w:val="en-US"/>
+        </w:rPr>
+        <w:t xml:space="preserve"> (NGO), which provided the tools necessary to manage networking, synchronization, and authority across players. All players begin their multiplayer experience inside a shared lobby space—visually represented by a plain white-box environment—where they await the host’s decision on which mini-game to launch. Only the host is given the ability to select the mini-game mode, reinforcing their role as the session leader. The system was designed to wait until all players were connected before transitioning to gameplay, ensuring a fair and unified start for every participant.</w:t>
+      </w:r>
+    </w:p>
+    <w:p>
+      <w:pPr>
+        <w:rPr>
+          <w:b/>
+          <w:bCs/>
+          <w:lang w:val="en-US"/>
+        </w:rPr>
+      </w:pPr>
+      <w:r>
+        <w:rPr>
+          <w:b/>
+          <w:bCs/>
+          <w:lang w:val="en-US"/>
+        </w:rPr>
+        <w:t xml:space="preserve">Transitioning players from the lobby to the mini-game locations presented an initial technical hurdle. Unity’s network architecture restricts player object movement to the server, meaning that the host alone does not have permission to reposition all players. To resolve this, </w:t>
+      </w:r>
+      <w:proofErr w:type="spellStart"/>
+      <w:r>
+        <w:rPr>
+          <w:b/>
+          <w:bCs/>
+          <w:lang w:val="en-US"/>
+        </w:rPr>
+        <w:t>ServerRPCs</w:t>
+      </w:r>
+      <w:proofErr w:type="spellEnd"/>
+      <w:r>
+        <w:rPr>
+          <w:b/>
+          <w:bCs/>
+          <w:lang w:val="en-US"/>
+        </w:rPr>
+        <w:t xml:space="preserve"> were used to instruct the server to teleport each player to the appropriate location—whether to the center of the island for the treasure hunt or to the pier for the boat race.</w:t>
+      </w:r>
+    </w:p>
+    <w:p>
+      <w:pPr>
+        <w:rPr>
+          <w:b/>
+          <w:bCs/>
+          <w:lang w:val="en-US"/>
+        </w:rPr>
+      </w:pPr>
+      <w:r>
+        <w:rPr>
+          <w:b/>
+          <w:bCs/>
+          <w:lang w:val="en-US"/>
+        </w:rPr>
+        <w:t>In the treasure hunt mini-game, one chest is spawned randomly among a set of carefully chosen locations to avoid placement issues. Players are free to explore the map, guided only by a user interface element displaying the real-time distance to the chest. Once a player reaches the chest, the system declares them the winner, displaying a victory screen. Other participants are simultaneously shown a message reflecting their loss, with both screens offering the option to disconnect from the session.</w:t>
+      </w:r>
+    </w:p>
+    <w:p>
+      <w:pPr>
+        <w:rPr>
+          <w:b/>
+          <w:bCs/>
+          <w:lang w:val="en-US"/>
+        </w:rPr>
+      </w:pPr>
+      <w:r>
+        <w:rPr>
+          <w:b/>
+          <w:bCs/>
+          <w:lang w:val="en-US"/>
+        </w:rPr>
+        <w:t xml:space="preserve">The boat race </w:t>
+      </w:r>
+      <w:proofErr w:type="gramStart"/>
+      <w:r>
+        <w:rPr>
+          <w:b/>
+          <w:bCs/>
+          <w:lang w:val="en-US"/>
+        </w:rPr>
+        <w:t>mini-game</w:t>
+      </w:r>
+      <w:proofErr w:type="gramEnd"/>
+      <w:r>
+        <w:rPr>
+          <w:b/>
+          <w:bCs/>
+          <w:lang w:val="en-US"/>
+        </w:rPr>
+        <w:t xml:space="preserve"> begins with each player being teleported to the pier, where their boats await. Once boarded, the objective is to sail across the map, guided by a series of buoys that mark the path to the </w:t>
+      </w:r>
+      <w:proofErr w:type="gramStart"/>
+      <w:r>
+        <w:rPr>
+          <w:b/>
+          <w:bCs/>
+          <w:lang w:val="en-US"/>
+        </w:rPr>
+        <w:t>final destination</w:t>
+      </w:r>
+      <w:proofErr w:type="gramEnd"/>
+      <w:r>
+        <w:rPr>
+          <w:b/>
+          <w:bCs/>
+          <w:lang w:val="en-US"/>
+        </w:rPr>
+        <w:t xml:space="preserve">. Interaction with the final buoy determines the winner. </w:t>
+      </w:r>
+      <w:proofErr w:type="gramStart"/>
+      <w:r>
+        <w:rPr>
+          <w:b/>
+          <w:bCs/>
+          <w:lang w:val="en-US"/>
+        </w:rPr>
+        <w:t>Similar to</w:t>
+      </w:r>
+      <w:proofErr w:type="gramEnd"/>
+      <w:r>
+        <w:rPr>
+          <w:b/>
+          <w:bCs/>
+          <w:lang w:val="en-US"/>
+        </w:rPr>
+        <w:t xml:space="preserve"> the treasure hunt, an appropriate user interface screen is triggered at the conclusion of the race based on whether a player wins or loses.</w:t>
+      </w:r>
+    </w:p>
+    <w:p>
+      <w:pPr>
+        <w:rPr>
+          <w:b/>
+          <w:bCs/>
+          <w:lang w:val="en-US"/>
+        </w:rPr>
+      </w:pPr>
+      <w:r>
+        <w:rPr>
+          <w:b/>
+          <w:bCs/>
+          <w:lang w:val="en-US"/>
+        </w:rPr>
+        <w:t>Robust session management was crucial to maintaining a stable multiplayer experience. A disconnect menu was made accessible at any time during gameplay, allowing players to leave a session manually. Special attention was given to the case of a host disconnecting; in such instances, the system was configured to automatically disconnect all clients to avoid unexpected behavior or lingering network objects.</w:t>
+      </w:r>
+    </w:p>
+    <w:p>
+      <w:pPr>
+        <w:rPr>
+          <w:b/>
+          <w:bCs/>
+          <w:lang w:val="en-US"/>
+        </w:rPr>
+      </w:pPr>
+      <w:r>
+        <w:rPr>
+          <w:b/>
+          <w:bCs/>
+          <w:lang w:val="en-US"/>
+        </w:rPr>
+        <w:t>Results</w:t>
+      </w:r>
+    </w:p>
+    <w:p>
+      <w:pPr>
+        <w:rPr>
+          <w:b/>
+          <w:bCs/>
+          <w:lang w:val="en-US"/>
+        </w:rPr>
+      </w:pPr>
+      <w:r>
+        <w:rPr>
+          <w:b/>
+          <w:bCs/>
+          <w:lang w:val="en-US"/>
+        </w:rPr>
+        <w:lastRenderedPageBreak/>
+        <w:t xml:space="preserve">The integration of multiplayer </w:t>
+      </w:r>
+      <w:proofErr w:type="gramStart"/>
+      <w:r>
+        <w:rPr>
+          <w:b/>
+          <w:bCs/>
+          <w:lang w:val="en-US"/>
+        </w:rPr>
+        <w:t>mini-games</w:t>
+      </w:r>
+      <w:proofErr w:type="gramEnd"/>
+      <w:r>
+        <w:rPr>
+          <w:b/>
+          <w:bCs/>
+          <w:lang w:val="en-US"/>
+        </w:rPr>
+        <w:t xml:space="preserve"> brought a dynamic new layer to the gameplay experience. These modes provided engaging activities that both complemented the main game and stood on their own as sources of enjoyment. The treasure hunt introduced a playful competition grounded in exploration, rewarding players for their awareness and mobility. The boat race, on the other hand, emphasized skillful navigation and route planning, offering a fast-paced challenge that felt authentic to the game’s nautical theme.</w:t>
+      </w:r>
+    </w:p>
+    <w:p>
+      <w:pPr>
+        <w:rPr>
+          <w:b/>
+          <w:bCs/>
+          <w:lang w:val="en-US"/>
+        </w:rPr>
+      </w:pPr>
+      <w:r>
+        <w:rPr>
+          <w:b/>
+          <w:bCs/>
+          <w:lang w:val="en-US"/>
+        </w:rPr>
+        <w:t xml:space="preserve">The technical implementation proved successful, with players able to connect, wait in a shared space, and transition into gameplay smoothly. The use of RPCs ensured that teleportation and object spawning occurred without authority errors, and the user interface effectively communicated progress and outcomes to all participants. Crucially, the system remained stable even </w:t>
+      </w:r>
+      <w:proofErr w:type="gramStart"/>
+      <w:r>
+        <w:rPr>
+          <w:b/>
+          <w:bCs/>
+          <w:lang w:val="en-US"/>
+        </w:rPr>
+        <w:t>under edge</w:t>
+      </w:r>
+      <w:proofErr w:type="gramEnd"/>
+      <w:r>
+        <w:rPr>
+          <w:b/>
+          <w:bCs/>
+          <w:lang w:val="en-US"/>
+        </w:rPr>
+        <w:t xml:space="preserve"> cases such as sudden host </w:t>
+      </w:r>
+      <w:proofErr w:type="gramStart"/>
+      <w:r>
+        <w:rPr>
+          <w:b/>
+          <w:bCs/>
+          <w:lang w:val="en-US"/>
+        </w:rPr>
+        <w:t>disconnection</w:t>
+      </w:r>
+      <w:proofErr w:type="gramEnd"/>
+      <w:r>
+        <w:rPr>
+          <w:b/>
+          <w:bCs/>
+          <w:lang w:val="en-US"/>
+        </w:rPr>
+        <w:t>.</w:t>
+      </w:r>
+    </w:p>
+    <w:p>
+      <w:pPr>
+        <w:rPr>
+          <w:b/>
+          <w:bCs/>
+          <w:lang w:val="en-US"/>
+        </w:rPr>
+      </w:pPr>
+      <w:r>
+        <w:rPr>
+          <w:b/>
+          <w:bCs/>
+          <w:lang w:val="en-US"/>
+        </w:rPr>
+        <w:t xml:space="preserve">Overall, the multiplayer component enriched the game world by adding meaningful social interaction and a fresh source of </w:t>
+      </w:r>
+      <w:proofErr w:type="spellStart"/>
+      <w:r>
+        <w:rPr>
+          <w:b/>
+          <w:bCs/>
+          <w:lang w:val="en-US"/>
+        </w:rPr>
+        <w:t>replayability</w:t>
+      </w:r>
+      <w:proofErr w:type="spellEnd"/>
+      <w:r>
+        <w:rPr>
+          <w:b/>
+          <w:bCs/>
+          <w:lang w:val="en-US"/>
+        </w:rPr>
+        <w:t>. It maintained alignment with the game's aesthetic and lore, while providing players with exciting, interactive ways to connect and compete.</w:t>
+      </w:r>
+    </w:p>
+    <w:p>
+      <w:pPr>
+        <w:rPr>
+          <w:b/>
+          <w:bCs/>
+          <w:sz w:val="36"/>
+          <w:szCs w:val="36"/>
+          <w:u w:val="single"/>
+          <w:lang w:val="en-US"/>
+        </w:rPr>
+      </w:pPr>
+      <w:r>
+        <w:rPr>
+          <w:b/>
+          <w:bCs/>
+          <w:sz w:val="36"/>
+          <w:szCs w:val="36"/>
+          <w:u w:val="single"/>
           <w:lang w:val="en-US"/>
         </w:rPr>
         <w:br w:type="page"/>
@@ -7433,6 +7899,304 @@
     </w:lvl>
   </w:abstractNum>
   <w:abstractNum w:abstractNumId="2" w15:restartNumberingAfterBreak="0">
+    <w:nsid w:val="0CE01FBE"/>
+    <w:multiLevelType w:val="multilevel"/>
+    <w:tmpl w:val="D74E7246"/>
+    <w:lvl w:ilvl="0">
+      <w:start w:val="1"/>
+      <w:numFmt w:val="bullet"/>
+      <w:lvlText w:val=""/>
+      <w:lvlJc w:val="left"/>
+      <w:pPr>
+        <w:tabs>
+          <w:tab w:val="num" w:pos="720"/>
+        </w:tabs>
+        <w:ind w:left="720" w:hanging="360"/>
+      </w:pPr>
+      <w:rPr>
+        <w:rFonts w:ascii="Symbol" w:hAnsi="Symbol" w:hint="default"/>
+        <w:sz w:val="20"/>
+      </w:rPr>
+    </w:lvl>
+    <w:lvl w:ilvl="1" w:tentative="1">
+      <w:start w:val="1"/>
+      <w:numFmt w:val="bullet"/>
+      <w:lvlText w:val="o"/>
+      <w:lvlJc w:val="left"/>
+      <w:pPr>
+        <w:tabs>
+          <w:tab w:val="num" w:pos="1440"/>
+        </w:tabs>
+        <w:ind w:left="1440" w:hanging="360"/>
+      </w:pPr>
+      <w:rPr>
+        <w:rFonts w:ascii="Courier New" w:hAnsi="Courier New" w:hint="default"/>
+        <w:sz w:val="20"/>
+      </w:rPr>
+    </w:lvl>
+    <w:lvl w:ilvl="2" w:tentative="1">
+      <w:start w:val="1"/>
+      <w:numFmt w:val="bullet"/>
+      <w:lvlText w:val=""/>
+      <w:lvlJc w:val="left"/>
+      <w:pPr>
+        <w:tabs>
+          <w:tab w:val="num" w:pos="2160"/>
+        </w:tabs>
+        <w:ind w:left="2160" w:hanging="360"/>
+      </w:pPr>
+      <w:rPr>
+        <w:rFonts w:ascii="Wingdings" w:hAnsi="Wingdings" w:hint="default"/>
+        <w:sz w:val="20"/>
+      </w:rPr>
+    </w:lvl>
+    <w:lvl w:ilvl="3" w:tentative="1">
+      <w:start w:val="1"/>
+      <w:numFmt w:val="bullet"/>
+      <w:lvlText w:val=""/>
+      <w:lvlJc w:val="left"/>
+      <w:pPr>
+        <w:tabs>
+          <w:tab w:val="num" w:pos="2880"/>
+        </w:tabs>
+        <w:ind w:left="2880" w:hanging="360"/>
+      </w:pPr>
+      <w:rPr>
+        <w:rFonts w:ascii="Wingdings" w:hAnsi="Wingdings" w:hint="default"/>
+        <w:sz w:val="20"/>
+      </w:rPr>
+    </w:lvl>
+    <w:lvl w:ilvl="4" w:tentative="1">
+      <w:start w:val="1"/>
+      <w:numFmt w:val="bullet"/>
+      <w:lvlText w:val=""/>
+      <w:lvlJc w:val="left"/>
+      <w:pPr>
+        <w:tabs>
+          <w:tab w:val="num" w:pos="3600"/>
+        </w:tabs>
+        <w:ind w:left="3600" w:hanging="360"/>
+      </w:pPr>
+      <w:rPr>
+        <w:rFonts w:ascii="Wingdings" w:hAnsi="Wingdings" w:hint="default"/>
+        <w:sz w:val="20"/>
+      </w:rPr>
+    </w:lvl>
+    <w:lvl w:ilvl="5" w:tentative="1">
+      <w:start w:val="1"/>
+      <w:numFmt w:val="bullet"/>
+      <w:lvlText w:val=""/>
+      <w:lvlJc w:val="left"/>
+      <w:pPr>
+        <w:tabs>
+          <w:tab w:val="num" w:pos="4320"/>
+        </w:tabs>
+        <w:ind w:left="4320" w:hanging="360"/>
+      </w:pPr>
+      <w:rPr>
+        <w:rFonts w:ascii="Wingdings" w:hAnsi="Wingdings" w:hint="default"/>
+        <w:sz w:val="20"/>
+      </w:rPr>
+    </w:lvl>
+    <w:lvl w:ilvl="6" w:tentative="1">
+      <w:start w:val="1"/>
+      <w:numFmt w:val="bullet"/>
+      <w:lvlText w:val=""/>
+      <w:lvlJc w:val="left"/>
+      <w:pPr>
+        <w:tabs>
+          <w:tab w:val="num" w:pos="5040"/>
+        </w:tabs>
+        <w:ind w:left="5040" w:hanging="360"/>
+      </w:pPr>
+      <w:rPr>
+        <w:rFonts w:ascii="Wingdings" w:hAnsi="Wingdings" w:hint="default"/>
+        <w:sz w:val="20"/>
+      </w:rPr>
+    </w:lvl>
+    <w:lvl w:ilvl="7" w:tentative="1">
+      <w:start w:val="1"/>
+      <w:numFmt w:val="bullet"/>
+      <w:lvlText w:val=""/>
+      <w:lvlJc w:val="left"/>
+      <w:pPr>
+        <w:tabs>
+          <w:tab w:val="num" w:pos="5760"/>
+        </w:tabs>
+        <w:ind w:left="5760" w:hanging="360"/>
+      </w:pPr>
+      <w:rPr>
+        <w:rFonts w:ascii="Wingdings" w:hAnsi="Wingdings" w:hint="default"/>
+        <w:sz w:val="20"/>
+      </w:rPr>
+    </w:lvl>
+    <w:lvl w:ilvl="8" w:tentative="1">
+      <w:start w:val="1"/>
+      <w:numFmt w:val="bullet"/>
+      <w:lvlText w:val=""/>
+      <w:lvlJc w:val="left"/>
+      <w:pPr>
+        <w:tabs>
+          <w:tab w:val="num" w:pos="6480"/>
+        </w:tabs>
+        <w:ind w:left="6480" w:hanging="360"/>
+      </w:pPr>
+      <w:rPr>
+        <w:rFonts w:ascii="Wingdings" w:hAnsi="Wingdings" w:hint="default"/>
+        <w:sz w:val="20"/>
+      </w:rPr>
+    </w:lvl>
+  </w:abstractNum>
+  <w:abstractNum w:abstractNumId="3" w15:restartNumberingAfterBreak="0">
+    <w:nsid w:val="142B5BF4"/>
+    <w:multiLevelType w:val="multilevel"/>
+    <w:tmpl w:val="C118542A"/>
+    <w:lvl w:ilvl="0">
+      <w:start w:val="1"/>
+      <w:numFmt w:val="bullet"/>
+      <w:lvlText w:val=""/>
+      <w:lvlJc w:val="left"/>
+      <w:pPr>
+        <w:tabs>
+          <w:tab w:val="num" w:pos="720"/>
+        </w:tabs>
+        <w:ind w:left="720" w:hanging="360"/>
+      </w:pPr>
+      <w:rPr>
+        <w:rFonts w:ascii="Symbol" w:hAnsi="Symbol" w:hint="default"/>
+        <w:sz w:val="20"/>
+      </w:rPr>
+    </w:lvl>
+    <w:lvl w:ilvl="1" w:tentative="1">
+      <w:start w:val="1"/>
+      <w:numFmt w:val="bullet"/>
+      <w:lvlText w:val="o"/>
+      <w:lvlJc w:val="left"/>
+      <w:pPr>
+        <w:tabs>
+          <w:tab w:val="num" w:pos="1440"/>
+        </w:tabs>
+        <w:ind w:left="1440" w:hanging="360"/>
+      </w:pPr>
+      <w:rPr>
+        <w:rFonts w:ascii="Courier New" w:hAnsi="Courier New" w:hint="default"/>
+        <w:sz w:val="20"/>
+      </w:rPr>
+    </w:lvl>
+    <w:lvl w:ilvl="2" w:tentative="1">
+      <w:start w:val="1"/>
+      <w:numFmt w:val="bullet"/>
+      <w:lvlText w:val=""/>
+      <w:lvlJc w:val="left"/>
+      <w:pPr>
+        <w:tabs>
+          <w:tab w:val="num" w:pos="2160"/>
+        </w:tabs>
+        <w:ind w:left="2160" w:hanging="360"/>
+      </w:pPr>
+      <w:rPr>
+        <w:rFonts w:ascii="Wingdings" w:hAnsi="Wingdings" w:hint="default"/>
+        <w:sz w:val="20"/>
+      </w:rPr>
+    </w:lvl>
+    <w:lvl w:ilvl="3" w:tentative="1">
+      <w:start w:val="1"/>
+      <w:numFmt w:val="bullet"/>
+      <w:lvlText w:val=""/>
+      <w:lvlJc w:val="left"/>
+      <w:pPr>
+        <w:tabs>
+          <w:tab w:val="num" w:pos="2880"/>
+        </w:tabs>
+        <w:ind w:left="2880" w:hanging="360"/>
+      </w:pPr>
+      <w:rPr>
+        <w:rFonts w:ascii="Wingdings" w:hAnsi="Wingdings" w:hint="default"/>
+        <w:sz w:val="20"/>
+      </w:rPr>
+    </w:lvl>
+    <w:lvl w:ilvl="4" w:tentative="1">
+      <w:start w:val="1"/>
+      <w:numFmt w:val="bullet"/>
+      <w:lvlText w:val=""/>
+      <w:lvlJc w:val="left"/>
+      <w:pPr>
+        <w:tabs>
+          <w:tab w:val="num" w:pos="3600"/>
+        </w:tabs>
+        <w:ind w:left="3600" w:hanging="360"/>
+      </w:pPr>
+      <w:rPr>
+        <w:rFonts w:ascii="Wingdings" w:hAnsi="Wingdings" w:hint="default"/>
+        <w:sz w:val="20"/>
+      </w:rPr>
+    </w:lvl>
+    <w:lvl w:ilvl="5" w:tentative="1">
+      <w:start w:val="1"/>
+      <w:numFmt w:val="bullet"/>
+      <w:lvlText w:val=""/>
+      <w:lvlJc w:val="left"/>
+      <w:pPr>
+        <w:tabs>
+          <w:tab w:val="num" w:pos="4320"/>
+        </w:tabs>
+        <w:ind w:left="4320" w:hanging="360"/>
+      </w:pPr>
+      <w:rPr>
+        <w:rFonts w:ascii="Wingdings" w:hAnsi="Wingdings" w:hint="default"/>
+        <w:sz w:val="20"/>
+      </w:rPr>
+    </w:lvl>
+    <w:lvl w:ilvl="6" w:tentative="1">
+      <w:start w:val="1"/>
+      <w:numFmt w:val="bullet"/>
+      <w:lvlText w:val=""/>
+      <w:lvlJc w:val="left"/>
+      <w:pPr>
+        <w:tabs>
+          <w:tab w:val="num" w:pos="5040"/>
+        </w:tabs>
+        <w:ind w:left="5040" w:hanging="360"/>
+      </w:pPr>
+      <w:rPr>
+        <w:rFonts w:ascii="Wingdings" w:hAnsi="Wingdings" w:hint="default"/>
+        <w:sz w:val="20"/>
+      </w:rPr>
+    </w:lvl>
+    <w:lvl w:ilvl="7" w:tentative="1">
+      <w:start w:val="1"/>
+      <w:numFmt w:val="bullet"/>
+      <w:lvlText w:val=""/>
+      <w:lvlJc w:val="left"/>
+      <w:pPr>
+        <w:tabs>
+          <w:tab w:val="num" w:pos="5760"/>
+        </w:tabs>
+        <w:ind w:left="5760" w:hanging="360"/>
+      </w:pPr>
+      <w:rPr>
+        <w:rFonts w:ascii="Wingdings" w:hAnsi="Wingdings" w:hint="default"/>
+        <w:sz w:val="20"/>
+      </w:rPr>
+    </w:lvl>
+    <w:lvl w:ilvl="8" w:tentative="1">
+      <w:start w:val="1"/>
+      <w:numFmt w:val="bullet"/>
+      <w:lvlText w:val=""/>
+      <w:lvlJc w:val="left"/>
+      <w:pPr>
+        <w:tabs>
+          <w:tab w:val="num" w:pos="6480"/>
+        </w:tabs>
+        <w:ind w:left="6480" w:hanging="360"/>
+      </w:pPr>
+      <w:rPr>
+        <w:rFonts w:ascii="Wingdings" w:hAnsi="Wingdings" w:hint="default"/>
+        <w:sz w:val="20"/>
+      </w:rPr>
+    </w:lvl>
+  </w:abstractNum>
+  <w:abstractNum w:abstractNumId="4" w15:restartNumberingAfterBreak="0">
     <w:nsid w:val="149267A7"/>
     <w:multiLevelType w:val="multilevel"/>
     <w:tmpl w:val="9F2005EE"/>
@@ -7581,7 +8345,7 @@
       </w:rPr>
     </w:lvl>
   </w:abstractNum>
-  <w:abstractNum w:abstractNumId="3" w15:restartNumberingAfterBreak="0">
+  <w:abstractNum w:abstractNumId="5" w15:restartNumberingAfterBreak="0">
     <w:nsid w:val="16D50F95"/>
     <w:multiLevelType w:val="multilevel"/>
     <w:tmpl w:val="06204FB2"/>
@@ -7730,7 +8494,7 @@
       </w:rPr>
     </w:lvl>
   </w:abstractNum>
-  <w:abstractNum w:abstractNumId="4" w15:restartNumberingAfterBreak="0">
+  <w:abstractNum w:abstractNumId="6" w15:restartNumberingAfterBreak="0">
     <w:nsid w:val="2A4D0CAA"/>
     <w:multiLevelType w:val="multilevel"/>
     <w:tmpl w:val="0FB6165A"/>
@@ -7879,7 +8643,7 @@
       </w:rPr>
     </w:lvl>
   </w:abstractNum>
-  <w:abstractNum w:abstractNumId="5" w15:restartNumberingAfterBreak="0">
+  <w:abstractNum w:abstractNumId="7" w15:restartNumberingAfterBreak="0">
     <w:nsid w:val="2C253063"/>
     <w:multiLevelType w:val="multilevel"/>
     <w:tmpl w:val="0F602954"/>
@@ -8028,7 +8792,7 @@
       </w:rPr>
     </w:lvl>
   </w:abstractNum>
-  <w:abstractNum w:abstractNumId="6" w15:restartNumberingAfterBreak="0">
+  <w:abstractNum w:abstractNumId="8" w15:restartNumberingAfterBreak="0">
     <w:nsid w:val="304F040E"/>
     <w:multiLevelType w:val="multilevel"/>
     <w:tmpl w:val="874CD932"/>
@@ -8177,7 +8941,156 @@
       </w:rPr>
     </w:lvl>
   </w:abstractNum>
-  <w:abstractNum w:abstractNumId="7" w15:restartNumberingAfterBreak="0">
+  <w:abstractNum w:abstractNumId="9" w15:restartNumberingAfterBreak="0">
+    <w:nsid w:val="45407759"/>
+    <w:multiLevelType w:val="multilevel"/>
+    <w:tmpl w:val="DC02D838"/>
+    <w:lvl w:ilvl="0">
+      <w:start w:val="1"/>
+      <w:numFmt w:val="bullet"/>
+      <w:lvlText w:val=""/>
+      <w:lvlJc w:val="left"/>
+      <w:pPr>
+        <w:tabs>
+          <w:tab w:val="num" w:pos="720"/>
+        </w:tabs>
+        <w:ind w:left="720" w:hanging="360"/>
+      </w:pPr>
+      <w:rPr>
+        <w:rFonts w:ascii="Symbol" w:hAnsi="Symbol" w:hint="default"/>
+        <w:sz w:val="20"/>
+      </w:rPr>
+    </w:lvl>
+    <w:lvl w:ilvl="1">
+      <w:start w:val="1"/>
+      <w:numFmt w:val="bullet"/>
+      <w:lvlText w:val="o"/>
+      <w:lvlJc w:val="left"/>
+      <w:pPr>
+        <w:tabs>
+          <w:tab w:val="num" w:pos="1440"/>
+        </w:tabs>
+        <w:ind w:left="1440" w:hanging="360"/>
+      </w:pPr>
+      <w:rPr>
+        <w:rFonts w:ascii="Courier New" w:hAnsi="Courier New" w:hint="default"/>
+        <w:sz w:val="20"/>
+      </w:rPr>
+    </w:lvl>
+    <w:lvl w:ilvl="2" w:tentative="1">
+      <w:start w:val="1"/>
+      <w:numFmt w:val="bullet"/>
+      <w:lvlText w:val=""/>
+      <w:lvlJc w:val="left"/>
+      <w:pPr>
+        <w:tabs>
+          <w:tab w:val="num" w:pos="2160"/>
+        </w:tabs>
+        <w:ind w:left="2160" w:hanging="360"/>
+      </w:pPr>
+      <w:rPr>
+        <w:rFonts w:ascii="Wingdings" w:hAnsi="Wingdings" w:hint="default"/>
+        <w:sz w:val="20"/>
+      </w:rPr>
+    </w:lvl>
+    <w:lvl w:ilvl="3" w:tentative="1">
+      <w:start w:val="1"/>
+      <w:numFmt w:val="bullet"/>
+      <w:lvlText w:val=""/>
+      <w:lvlJc w:val="left"/>
+      <w:pPr>
+        <w:tabs>
+          <w:tab w:val="num" w:pos="2880"/>
+        </w:tabs>
+        <w:ind w:left="2880" w:hanging="360"/>
+      </w:pPr>
+      <w:rPr>
+        <w:rFonts w:ascii="Wingdings" w:hAnsi="Wingdings" w:hint="default"/>
+        <w:sz w:val="20"/>
+      </w:rPr>
+    </w:lvl>
+    <w:lvl w:ilvl="4" w:tentative="1">
+      <w:start w:val="1"/>
+      <w:numFmt w:val="bullet"/>
+      <w:lvlText w:val=""/>
+      <w:lvlJc w:val="left"/>
+      <w:pPr>
+        <w:tabs>
+          <w:tab w:val="num" w:pos="3600"/>
+        </w:tabs>
+        <w:ind w:left="3600" w:hanging="360"/>
+      </w:pPr>
+      <w:rPr>
+        <w:rFonts w:ascii="Wingdings" w:hAnsi="Wingdings" w:hint="default"/>
+        <w:sz w:val="20"/>
+      </w:rPr>
+    </w:lvl>
+    <w:lvl w:ilvl="5" w:tentative="1">
+      <w:start w:val="1"/>
+      <w:numFmt w:val="bullet"/>
+      <w:lvlText w:val=""/>
+      <w:lvlJc w:val="left"/>
+      <w:pPr>
+        <w:tabs>
+          <w:tab w:val="num" w:pos="4320"/>
+        </w:tabs>
+        <w:ind w:left="4320" w:hanging="360"/>
+      </w:pPr>
+      <w:rPr>
+        <w:rFonts w:ascii="Wingdings" w:hAnsi="Wingdings" w:hint="default"/>
+        <w:sz w:val="20"/>
+      </w:rPr>
+    </w:lvl>
+    <w:lvl w:ilvl="6" w:tentative="1">
+      <w:start w:val="1"/>
+      <w:numFmt w:val="bullet"/>
+      <w:lvlText w:val=""/>
+      <w:lvlJc w:val="left"/>
+      <w:pPr>
+        <w:tabs>
+          <w:tab w:val="num" w:pos="5040"/>
+        </w:tabs>
+        <w:ind w:left="5040" w:hanging="360"/>
+      </w:pPr>
+      <w:rPr>
+        <w:rFonts w:ascii="Wingdings" w:hAnsi="Wingdings" w:hint="default"/>
+        <w:sz w:val="20"/>
+      </w:rPr>
+    </w:lvl>
+    <w:lvl w:ilvl="7" w:tentative="1">
+      <w:start w:val="1"/>
+      <w:numFmt w:val="bullet"/>
+      <w:lvlText w:val=""/>
+      <w:lvlJc w:val="left"/>
+      <w:pPr>
+        <w:tabs>
+          <w:tab w:val="num" w:pos="5760"/>
+        </w:tabs>
+        <w:ind w:left="5760" w:hanging="360"/>
+      </w:pPr>
+      <w:rPr>
+        <w:rFonts w:ascii="Wingdings" w:hAnsi="Wingdings" w:hint="default"/>
+        <w:sz w:val="20"/>
+      </w:rPr>
+    </w:lvl>
+    <w:lvl w:ilvl="8" w:tentative="1">
+      <w:start w:val="1"/>
+      <w:numFmt w:val="bullet"/>
+      <w:lvlText w:val=""/>
+      <w:lvlJc w:val="left"/>
+      <w:pPr>
+        <w:tabs>
+          <w:tab w:val="num" w:pos="6480"/>
+        </w:tabs>
+        <w:ind w:left="6480" w:hanging="360"/>
+      </w:pPr>
+      <w:rPr>
+        <w:rFonts w:ascii="Wingdings" w:hAnsi="Wingdings" w:hint="default"/>
+        <w:sz w:val="20"/>
+      </w:rPr>
+    </w:lvl>
+  </w:abstractNum>
+  <w:abstractNum w:abstractNumId="10" w15:restartNumberingAfterBreak="0">
     <w:nsid w:val="4CC730CD"/>
     <w:multiLevelType w:val="multilevel"/>
     <w:tmpl w:val="DA2A06EE"/>
@@ -8326,7 +9239,7 @@
       </w:rPr>
     </w:lvl>
   </w:abstractNum>
-  <w:abstractNum w:abstractNumId="8" w15:restartNumberingAfterBreak="0">
+  <w:abstractNum w:abstractNumId="11" w15:restartNumberingAfterBreak="0">
     <w:nsid w:val="4E0C6C08"/>
     <w:multiLevelType w:val="multilevel"/>
     <w:tmpl w:val="9506867E"/>
@@ -8475,7 +9388,156 @@
       </w:rPr>
     </w:lvl>
   </w:abstractNum>
-  <w:abstractNum w:abstractNumId="9" w15:restartNumberingAfterBreak="0">
+  <w:abstractNum w:abstractNumId="12" w15:restartNumberingAfterBreak="0">
+    <w:nsid w:val="59640B15"/>
+    <w:multiLevelType w:val="multilevel"/>
+    <w:tmpl w:val="B13A842C"/>
+    <w:lvl w:ilvl="0">
+      <w:start w:val="1"/>
+      <w:numFmt w:val="bullet"/>
+      <w:lvlText w:val=""/>
+      <w:lvlJc w:val="left"/>
+      <w:pPr>
+        <w:tabs>
+          <w:tab w:val="num" w:pos="720"/>
+        </w:tabs>
+        <w:ind w:left="720" w:hanging="360"/>
+      </w:pPr>
+      <w:rPr>
+        <w:rFonts w:ascii="Symbol" w:hAnsi="Symbol" w:hint="default"/>
+        <w:sz w:val="20"/>
+      </w:rPr>
+    </w:lvl>
+    <w:lvl w:ilvl="1" w:tentative="1">
+      <w:start w:val="1"/>
+      <w:numFmt w:val="bullet"/>
+      <w:lvlText w:val="o"/>
+      <w:lvlJc w:val="left"/>
+      <w:pPr>
+        <w:tabs>
+          <w:tab w:val="num" w:pos="1440"/>
+        </w:tabs>
+        <w:ind w:left="1440" w:hanging="360"/>
+      </w:pPr>
+      <w:rPr>
+        <w:rFonts w:ascii="Courier New" w:hAnsi="Courier New" w:hint="default"/>
+        <w:sz w:val="20"/>
+      </w:rPr>
+    </w:lvl>
+    <w:lvl w:ilvl="2" w:tentative="1">
+      <w:start w:val="1"/>
+      <w:numFmt w:val="bullet"/>
+      <w:lvlText w:val=""/>
+      <w:lvlJc w:val="left"/>
+      <w:pPr>
+        <w:tabs>
+          <w:tab w:val="num" w:pos="2160"/>
+        </w:tabs>
+        <w:ind w:left="2160" w:hanging="360"/>
+      </w:pPr>
+      <w:rPr>
+        <w:rFonts w:ascii="Wingdings" w:hAnsi="Wingdings" w:hint="default"/>
+        <w:sz w:val="20"/>
+      </w:rPr>
+    </w:lvl>
+    <w:lvl w:ilvl="3" w:tentative="1">
+      <w:start w:val="1"/>
+      <w:numFmt w:val="bullet"/>
+      <w:lvlText w:val=""/>
+      <w:lvlJc w:val="left"/>
+      <w:pPr>
+        <w:tabs>
+          <w:tab w:val="num" w:pos="2880"/>
+        </w:tabs>
+        <w:ind w:left="2880" w:hanging="360"/>
+      </w:pPr>
+      <w:rPr>
+        <w:rFonts w:ascii="Wingdings" w:hAnsi="Wingdings" w:hint="default"/>
+        <w:sz w:val="20"/>
+      </w:rPr>
+    </w:lvl>
+    <w:lvl w:ilvl="4" w:tentative="1">
+      <w:start w:val="1"/>
+      <w:numFmt w:val="bullet"/>
+      <w:lvlText w:val=""/>
+      <w:lvlJc w:val="left"/>
+      <w:pPr>
+        <w:tabs>
+          <w:tab w:val="num" w:pos="3600"/>
+        </w:tabs>
+        <w:ind w:left="3600" w:hanging="360"/>
+      </w:pPr>
+      <w:rPr>
+        <w:rFonts w:ascii="Wingdings" w:hAnsi="Wingdings" w:hint="default"/>
+        <w:sz w:val="20"/>
+      </w:rPr>
+    </w:lvl>
+    <w:lvl w:ilvl="5" w:tentative="1">
+      <w:start w:val="1"/>
+      <w:numFmt w:val="bullet"/>
+      <w:lvlText w:val=""/>
+      <w:lvlJc w:val="left"/>
+      <w:pPr>
+        <w:tabs>
+          <w:tab w:val="num" w:pos="4320"/>
+        </w:tabs>
+        <w:ind w:left="4320" w:hanging="360"/>
+      </w:pPr>
+      <w:rPr>
+        <w:rFonts w:ascii="Wingdings" w:hAnsi="Wingdings" w:hint="default"/>
+        <w:sz w:val="20"/>
+      </w:rPr>
+    </w:lvl>
+    <w:lvl w:ilvl="6" w:tentative="1">
+      <w:start w:val="1"/>
+      <w:numFmt w:val="bullet"/>
+      <w:lvlText w:val=""/>
+      <w:lvlJc w:val="left"/>
+      <w:pPr>
+        <w:tabs>
+          <w:tab w:val="num" w:pos="5040"/>
+        </w:tabs>
+        <w:ind w:left="5040" w:hanging="360"/>
+      </w:pPr>
+      <w:rPr>
+        <w:rFonts w:ascii="Wingdings" w:hAnsi="Wingdings" w:hint="default"/>
+        <w:sz w:val="20"/>
+      </w:rPr>
+    </w:lvl>
+    <w:lvl w:ilvl="7" w:tentative="1">
+      <w:start w:val="1"/>
+      <w:numFmt w:val="bullet"/>
+      <w:lvlText w:val=""/>
+      <w:lvlJc w:val="left"/>
+      <w:pPr>
+        <w:tabs>
+          <w:tab w:val="num" w:pos="5760"/>
+        </w:tabs>
+        <w:ind w:left="5760" w:hanging="360"/>
+      </w:pPr>
+      <w:rPr>
+        <w:rFonts w:ascii="Wingdings" w:hAnsi="Wingdings" w:hint="default"/>
+        <w:sz w:val="20"/>
+      </w:rPr>
+    </w:lvl>
+    <w:lvl w:ilvl="8" w:tentative="1">
+      <w:start w:val="1"/>
+      <w:numFmt w:val="bullet"/>
+      <w:lvlText w:val=""/>
+      <w:lvlJc w:val="left"/>
+      <w:pPr>
+        <w:tabs>
+          <w:tab w:val="num" w:pos="6480"/>
+        </w:tabs>
+        <w:ind w:left="6480" w:hanging="360"/>
+      </w:pPr>
+      <w:rPr>
+        <w:rFonts w:ascii="Wingdings" w:hAnsi="Wingdings" w:hint="default"/>
+        <w:sz w:val="20"/>
+      </w:rPr>
+    </w:lvl>
+  </w:abstractNum>
+  <w:abstractNum w:abstractNumId="13" w15:restartNumberingAfterBreak="0">
     <w:nsid w:val="5DBE7FAC"/>
     <w:multiLevelType w:val="multilevel"/>
     <w:tmpl w:val="83087172"/>
@@ -8624,7 +9686,156 @@
       </w:rPr>
     </w:lvl>
   </w:abstractNum>
-  <w:abstractNum w:abstractNumId="10" w15:restartNumberingAfterBreak="0">
+  <w:abstractNum w:abstractNumId="14" w15:restartNumberingAfterBreak="0">
+    <w:nsid w:val="60B13B4F"/>
+    <w:multiLevelType w:val="multilevel"/>
+    <w:tmpl w:val="15907554"/>
+    <w:lvl w:ilvl="0">
+      <w:start w:val="1"/>
+      <w:numFmt w:val="bullet"/>
+      <w:lvlText w:val=""/>
+      <w:lvlJc w:val="left"/>
+      <w:pPr>
+        <w:tabs>
+          <w:tab w:val="num" w:pos="720"/>
+        </w:tabs>
+        <w:ind w:left="720" w:hanging="360"/>
+      </w:pPr>
+      <w:rPr>
+        <w:rFonts w:ascii="Symbol" w:hAnsi="Symbol" w:hint="default"/>
+        <w:sz w:val="20"/>
+      </w:rPr>
+    </w:lvl>
+    <w:lvl w:ilvl="1" w:tentative="1">
+      <w:start w:val="1"/>
+      <w:numFmt w:val="bullet"/>
+      <w:lvlText w:val="o"/>
+      <w:lvlJc w:val="left"/>
+      <w:pPr>
+        <w:tabs>
+          <w:tab w:val="num" w:pos="1440"/>
+        </w:tabs>
+        <w:ind w:left="1440" w:hanging="360"/>
+      </w:pPr>
+      <w:rPr>
+        <w:rFonts w:ascii="Courier New" w:hAnsi="Courier New" w:hint="default"/>
+        <w:sz w:val="20"/>
+      </w:rPr>
+    </w:lvl>
+    <w:lvl w:ilvl="2" w:tentative="1">
+      <w:start w:val="1"/>
+      <w:numFmt w:val="bullet"/>
+      <w:lvlText w:val=""/>
+      <w:lvlJc w:val="left"/>
+      <w:pPr>
+        <w:tabs>
+          <w:tab w:val="num" w:pos="2160"/>
+        </w:tabs>
+        <w:ind w:left="2160" w:hanging="360"/>
+      </w:pPr>
+      <w:rPr>
+        <w:rFonts w:ascii="Wingdings" w:hAnsi="Wingdings" w:hint="default"/>
+        <w:sz w:val="20"/>
+      </w:rPr>
+    </w:lvl>
+    <w:lvl w:ilvl="3" w:tentative="1">
+      <w:start w:val="1"/>
+      <w:numFmt w:val="bullet"/>
+      <w:lvlText w:val=""/>
+      <w:lvlJc w:val="left"/>
+      <w:pPr>
+        <w:tabs>
+          <w:tab w:val="num" w:pos="2880"/>
+        </w:tabs>
+        <w:ind w:left="2880" w:hanging="360"/>
+      </w:pPr>
+      <w:rPr>
+        <w:rFonts w:ascii="Wingdings" w:hAnsi="Wingdings" w:hint="default"/>
+        <w:sz w:val="20"/>
+      </w:rPr>
+    </w:lvl>
+    <w:lvl w:ilvl="4" w:tentative="1">
+      <w:start w:val="1"/>
+      <w:numFmt w:val="bullet"/>
+      <w:lvlText w:val=""/>
+      <w:lvlJc w:val="left"/>
+      <w:pPr>
+        <w:tabs>
+          <w:tab w:val="num" w:pos="3600"/>
+        </w:tabs>
+        <w:ind w:left="3600" w:hanging="360"/>
+      </w:pPr>
+      <w:rPr>
+        <w:rFonts w:ascii="Wingdings" w:hAnsi="Wingdings" w:hint="default"/>
+        <w:sz w:val="20"/>
+      </w:rPr>
+    </w:lvl>
+    <w:lvl w:ilvl="5" w:tentative="1">
+      <w:start w:val="1"/>
+      <w:numFmt w:val="bullet"/>
+      <w:lvlText w:val=""/>
+      <w:lvlJc w:val="left"/>
+      <w:pPr>
+        <w:tabs>
+          <w:tab w:val="num" w:pos="4320"/>
+        </w:tabs>
+        <w:ind w:left="4320" w:hanging="360"/>
+      </w:pPr>
+      <w:rPr>
+        <w:rFonts w:ascii="Wingdings" w:hAnsi="Wingdings" w:hint="default"/>
+        <w:sz w:val="20"/>
+      </w:rPr>
+    </w:lvl>
+    <w:lvl w:ilvl="6" w:tentative="1">
+      <w:start w:val="1"/>
+      <w:numFmt w:val="bullet"/>
+      <w:lvlText w:val=""/>
+      <w:lvlJc w:val="left"/>
+      <w:pPr>
+        <w:tabs>
+          <w:tab w:val="num" w:pos="5040"/>
+        </w:tabs>
+        <w:ind w:left="5040" w:hanging="360"/>
+      </w:pPr>
+      <w:rPr>
+        <w:rFonts w:ascii="Wingdings" w:hAnsi="Wingdings" w:hint="default"/>
+        <w:sz w:val="20"/>
+      </w:rPr>
+    </w:lvl>
+    <w:lvl w:ilvl="7" w:tentative="1">
+      <w:start w:val="1"/>
+      <w:numFmt w:val="bullet"/>
+      <w:lvlText w:val=""/>
+      <w:lvlJc w:val="left"/>
+      <w:pPr>
+        <w:tabs>
+          <w:tab w:val="num" w:pos="5760"/>
+        </w:tabs>
+        <w:ind w:left="5760" w:hanging="360"/>
+      </w:pPr>
+      <w:rPr>
+        <w:rFonts w:ascii="Wingdings" w:hAnsi="Wingdings" w:hint="default"/>
+        <w:sz w:val="20"/>
+      </w:rPr>
+    </w:lvl>
+    <w:lvl w:ilvl="8" w:tentative="1">
+      <w:start w:val="1"/>
+      <w:numFmt w:val="bullet"/>
+      <w:lvlText w:val=""/>
+      <w:lvlJc w:val="left"/>
+      <w:pPr>
+        <w:tabs>
+          <w:tab w:val="num" w:pos="6480"/>
+        </w:tabs>
+        <w:ind w:left="6480" w:hanging="360"/>
+      </w:pPr>
+      <w:rPr>
+        <w:rFonts w:ascii="Wingdings" w:hAnsi="Wingdings" w:hint="default"/>
+        <w:sz w:val="20"/>
+      </w:rPr>
+    </w:lvl>
+  </w:abstractNum>
+  <w:abstractNum w:abstractNumId="15" w15:restartNumberingAfterBreak="0">
     <w:nsid w:val="62C61146"/>
     <w:multiLevelType w:val="multilevel"/>
     <w:tmpl w:val="CF2448D8"/>
@@ -8773,7 +9984,7 @@
       </w:rPr>
     </w:lvl>
   </w:abstractNum>
-  <w:abstractNum w:abstractNumId="11" w15:restartNumberingAfterBreak="0">
+  <w:abstractNum w:abstractNumId="16" w15:restartNumberingAfterBreak="0">
     <w:nsid w:val="64740F83"/>
     <w:multiLevelType w:val="multilevel"/>
     <w:tmpl w:val="7A824DD2"/>
@@ -8922,7 +10133,7 @@
       </w:rPr>
     </w:lvl>
   </w:abstractNum>
-  <w:abstractNum w:abstractNumId="12" w15:restartNumberingAfterBreak="0">
+  <w:abstractNum w:abstractNumId="17" w15:restartNumberingAfterBreak="0">
     <w:nsid w:val="661A3B91"/>
     <w:multiLevelType w:val="multilevel"/>
     <w:tmpl w:val="D4508EFC"/>
@@ -9071,7 +10282,7 @@
       </w:rPr>
     </w:lvl>
   </w:abstractNum>
-  <w:abstractNum w:abstractNumId="13" w15:restartNumberingAfterBreak="0">
+  <w:abstractNum w:abstractNumId="18" w15:restartNumberingAfterBreak="0">
     <w:nsid w:val="66E82693"/>
     <w:multiLevelType w:val="multilevel"/>
     <w:tmpl w:val="443889FE"/>
@@ -9220,7 +10431,7 @@
       </w:rPr>
     </w:lvl>
   </w:abstractNum>
-  <w:abstractNum w:abstractNumId="14" w15:restartNumberingAfterBreak="0">
+  <w:abstractNum w:abstractNumId="19" w15:restartNumberingAfterBreak="0">
     <w:nsid w:val="6DBF7F8E"/>
     <w:multiLevelType w:val="multilevel"/>
     <w:tmpl w:val="7B6C7054"/>
@@ -9369,7 +10580,7 @@
       </w:rPr>
     </w:lvl>
   </w:abstractNum>
-  <w:abstractNum w:abstractNumId="15" w15:restartNumberingAfterBreak="0">
+  <w:abstractNum w:abstractNumId="20" w15:restartNumberingAfterBreak="0">
     <w:nsid w:val="70356058"/>
     <w:multiLevelType w:val="multilevel"/>
     <w:tmpl w:val="9EFEEACE"/>
@@ -9518,7 +10729,156 @@
       </w:rPr>
     </w:lvl>
   </w:abstractNum>
-  <w:abstractNum w:abstractNumId="16" w15:restartNumberingAfterBreak="0">
+  <w:abstractNum w:abstractNumId="21" w15:restartNumberingAfterBreak="0">
+    <w:nsid w:val="70ED0C80"/>
+    <w:multiLevelType w:val="multilevel"/>
+    <w:tmpl w:val="5C78D676"/>
+    <w:lvl w:ilvl="0">
+      <w:start w:val="1"/>
+      <w:numFmt w:val="bullet"/>
+      <w:lvlText w:val=""/>
+      <w:lvlJc w:val="left"/>
+      <w:pPr>
+        <w:tabs>
+          <w:tab w:val="num" w:pos="720"/>
+        </w:tabs>
+        <w:ind w:left="720" w:hanging="360"/>
+      </w:pPr>
+      <w:rPr>
+        <w:rFonts w:ascii="Symbol" w:hAnsi="Symbol" w:hint="default"/>
+        <w:sz w:val="20"/>
+      </w:rPr>
+    </w:lvl>
+    <w:lvl w:ilvl="1" w:tentative="1">
+      <w:start w:val="1"/>
+      <w:numFmt w:val="bullet"/>
+      <w:lvlText w:val="o"/>
+      <w:lvlJc w:val="left"/>
+      <w:pPr>
+        <w:tabs>
+          <w:tab w:val="num" w:pos="1440"/>
+        </w:tabs>
+        <w:ind w:left="1440" w:hanging="360"/>
+      </w:pPr>
+      <w:rPr>
+        <w:rFonts w:ascii="Courier New" w:hAnsi="Courier New" w:hint="default"/>
+        <w:sz w:val="20"/>
+      </w:rPr>
+    </w:lvl>
+    <w:lvl w:ilvl="2" w:tentative="1">
+      <w:start w:val="1"/>
+      <w:numFmt w:val="bullet"/>
+      <w:lvlText w:val=""/>
+      <w:lvlJc w:val="left"/>
+      <w:pPr>
+        <w:tabs>
+          <w:tab w:val="num" w:pos="2160"/>
+        </w:tabs>
+        <w:ind w:left="2160" w:hanging="360"/>
+      </w:pPr>
+      <w:rPr>
+        <w:rFonts w:ascii="Wingdings" w:hAnsi="Wingdings" w:hint="default"/>
+        <w:sz w:val="20"/>
+      </w:rPr>
+    </w:lvl>
+    <w:lvl w:ilvl="3" w:tentative="1">
+      <w:start w:val="1"/>
+      <w:numFmt w:val="bullet"/>
+      <w:lvlText w:val=""/>
+      <w:lvlJc w:val="left"/>
+      <w:pPr>
+        <w:tabs>
+          <w:tab w:val="num" w:pos="2880"/>
+        </w:tabs>
+        <w:ind w:left="2880" w:hanging="360"/>
+      </w:pPr>
+      <w:rPr>
+        <w:rFonts w:ascii="Wingdings" w:hAnsi="Wingdings" w:hint="default"/>
+        <w:sz w:val="20"/>
+      </w:rPr>
+    </w:lvl>
+    <w:lvl w:ilvl="4" w:tentative="1">
+      <w:start w:val="1"/>
+      <w:numFmt w:val="bullet"/>
+      <w:lvlText w:val=""/>
+      <w:lvlJc w:val="left"/>
+      <w:pPr>
+        <w:tabs>
+          <w:tab w:val="num" w:pos="3600"/>
+        </w:tabs>
+        <w:ind w:left="3600" w:hanging="360"/>
+      </w:pPr>
+      <w:rPr>
+        <w:rFonts w:ascii="Wingdings" w:hAnsi="Wingdings" w:hint="default"/>
+        <w:sz w:val="20"/>
+      </w:rPr>
+    </w:lvl>
+    <w:lvl w:ilvl="5" w:tentative="1">
+      <w:start w:val="1"/>
+      <w:numFmt w:val="bullet"/>
+      <w:lvlText w:val=""/>
+      <w:lvlJc w:val="left"/>
+      <w:pPr>
+        <w:tabs>
+          <w:tab w:val="num" w:pos="4320"/>
+        </w:tabs>
+        <w:ind w:left="4320" w:hanging="360"/>
+      </w:pPr>
+      <w:rPr>
+        <w:rFonts w:ascii="Wingdings" w:hAnsi="Wingdings" w:hint="default"/>
+        <w:sz w:val="20"/>
+      </w:rPr>
+    </w:lvl>
+    <w:lvl w:ilvl="6" w:tentative="1">
+      <w:start w:val="1"/>
+      <w:numFmt w:val="bullet"/>
+      <w:lvlText w:val=""/>
+      <w:lvlJc w:val="left"/>
+      <w:pPr>
+        <w:tabs>
+          <w:tab w:val="num" w:pos="5040"/>
+        </w:tabs>
+        <w:ind w:left="5040" w:hanging="360"/>
+      </w:pPr>
+      <w:rPr>
+        <w:rFonts w:ascii="Wingdings" w:hAnsi="Wingdings" w:hint="default"/>
+        <w:sz w:val="20"/>
+      </w:rPr>
+    </w:lvl>
+    <w:lvl w:ilvl="7" w:tentative="1">
+      <w:start w:val="1"/>
+      <w:numFmt w:val="bullet"/>
+      <w:lvlText w:val=""/>
+      <w:lvlJc w:val="left"/>
+      <w:pPr>
+        <w:tabs>
+          <w:tab w:val="num" w:pos="5760"/>
+        </w:tabs>
+        <w:ind w:left="5760" w:hanging="360"/>
+      </w:pPr>
+      <w:rPr>
+        <w:rFonts w:ascii="Wingdings" w:hAnsi="Wingdings" w:hint="default"/>
+        <w:sz w:val="20"/>
+      </w:rPr>
+    </w:lvl>
+    <w:lvl w:ilvl="8" w:tentative="1">
+      <w:start w:val="1"/>
+      <w:numFmt w:val="bullet"/>
+      <w:lvlText w:val=""/>
+      <w:lvlJc w:val="left"/>
+      <w:pPr>
+        <w:tabs>
+          <w:tab w:val="num" w:pos="6480"/>
+        </w:tabs>
+        <w:ind w:left="6480" w:hanging="360"/>
+      </w:pPr>
+      <w:rPr>
+        <w:rFonts w:ascii="Wingdings" w:hAnsi="Wingdings" w:hint="default"/>
+        <w:sz w:val="20"/>
+      </w:rPr>
+    </w:lvl>
+  </w:abstractNum>
+  <w:abstractNum w:abstractNumId="22" w15:restartNumberingAfterBreak="0">
     <w:nsid w:val="74ED0413"/>
     <w:multiLevelType w:val="multilevel"/>
     <w:tmpl w:val="1B8051DC"/>
@@ -9631,7 +10991,7 @@
       </w:pPr>
     </w:lvl>
   </w:abstractNum>
-  <w:abstractNum w:abstractNumId="17" w15:restartNumberingAfterBreak="0">
+  <w:abstractNum w:abstractNumId="23" w15:restartNumberingAfterBreak="0">
     <w:nsid w:val="75C006B2"/>
     <w:multiLevelType w:val="multilevel"/>
     <w:tmpl w:val="3B664762"/>
@@ -9780,7 +11140,156 @@
       </w:rPr>
     </w:lvl>
   </w:abstractNum>
-  <w:abstractNum w:abstractNumId="18" w15:restartNumberingAfterBreak="0">
+  <w:abstractNum w:abstractNumId="24" w15:restartNumberingAfterBreak="0">
+    <w:nsid w:val="7961492B"/>
+    <w:multiLevelType w:val="multilevel"/>
+    <w:tmpl w:val="6A76BC6C"/>
+    <w:lvl w:ilvl="0">
+      <w:start w:val="1"/>
+      <w:numFmt w:val="bullet"/>
+      <w:lvlText w:val=""/>
+      <w:lvlJc w:val="left"/>
+      <w:pPr>
+        <w:tabs>
+          <w:tab w:val="num" w:pos="720"/>
+        </w:tabs>
+        <w:ind w:left="720" w:hanging="360"/>
+      </w:pPr>
+      <w:rPr>
+        <w:rFonts w:ascii="Symbol" w:hAnsi="Symbol" w:hint="default"/>
+        <w:sz w:val="20"/>
+      </w:rPr>
+    </w:lvl>
+    <w:lvl w:ilvl="1" w:tentative="1">
+      <w:start w:val="1"/>
+      <w:numFmt w:val="bullet"/>
+      <w:lvlText w:val="o"/>
+      <w:lvlJc w:val="left"/>
+      <w:pPr>
+        <w:tabs>
+          <w:tab w:val="num" w:pos="1440"/>
+        </w:tabs>
+        <w:ind w:left="1440" w:hanging="360"/>
+      </w:pPr>
+      <w:rPr>
+        <w:rFonts w:ascii="Courier New" w:hAnsi="Courier New" w:hint="default"/>
+        <w:sz w:val="20"/>
+      </w:rPr>
+    </w:lvl>
+    <w:lvl w:ilvl="2" w:tentative="1">
+      <w:start w:val="1"/>
+      <w:numFmt w:val="bullet"/>
+      <w:lvlText w:val=""/>
+      <w:lvlJc w:val="left"/>
+      <w:pPr>
+        <w:tabs>
+          <w:tab w:val="num" w:pos="2160"/>
+        </w:tabs>
+        <w:ind w:left="2160" w:hanging="360"/>
+      </w:pPr>
+      <w:rPr>
+        <w:rFonts w:ascii="Wingdings" w:hAnsi="Wingdings" w:hint="default"/>
+        <w:sz w:val="20"/>
+      </w:rPr>
+    </w:lvl>
+    <w:lvl w:ilvl="3" w:tentative="1">
+      <w:start w:val="1"/>
+      <w:numFmt w:val="bullet"/>
+      <w:lvlText w:val=""/>
+      <w:lvlJc w:val="left"/>
+      <w:pPr>
+        <w:tabs>
+          <w:tab w:val="num" w:pos="2880"/>
+        </w:tabs>
+        <w:ind w:left="2880" w:hanging="360"/>
+      </w:pPr>
+      <w:rPr>
+        <w:rFonts w:ascii="Wingdings" w:hAnsi="Wingdings" w:hint="default"/>
+        <w:sz w:val="20"/>
+      </w:rPr>
+    </w:lvl>
+    <w:lvl w:ilvl="4" w:tentative="1">
+      <w:start w:val="1"/>
+      <w:numFmt w:val="bullet"/>
+      <w:lvlText w:val=""/>
+      <w:lvlJc w:val="left"/>
+      <w:pPr>
+        <w:tabs>
+          <w:tab w:val="num" w:pos="3600"/>
+        </w:tabs>
+        <w:ind w:left="3600" w:hanging="360"/>
+      </w:pPr>
+      <w:rPr>
+        <w:rFonts w:ascii="Wingdings" w:hAnsi="Wingdings" w:hint="default"/>
+        <w:sz w:val="20"/>
+      </w:rPr>
+    </w:lvl>
+    <w:lvl w:ilvl="5" w:tentative="1">
+      <w:start w:val="1"/>
+      <w:numFmt w:val="bullet"/>
+      <w:lvlText w:val=""/>
+      <w:lvlJc w:val="left"/>
+      <w:pPr>
+        <w:tabs>
+          <w:tab w:val="num" w:pos="4320"/>
+        </w:tabs>
+        <w:ind w:left="4320" w:hanging="360"/>
+      </w:pPr>
+      <w:rPr>
+        <w:rFonts w:ascii="Wingdings" w:hAnsi="Wingdings" w:hint="default"/>
+        <w:sz w:val="20"/>
+      </w:rPr>
+    </w:lvl>
+    <w:lvl w:ilvl="6" w:tentative="1">
+      <w:start w:val="1"/>
+      <w:numFmt w:val="bullet"/>
+      <w:lvlText w:val=""/>
+      <w:lvlJc w:val="left"/>
+      <w:pPr>
+        <w:tabs>
+          <w:tab w:val="num" w:pos="5040"/>
+        </w:tabs>
+        <w:ind w:left="5040" w:hanging="360"/>
+      </w:pPr>
+      <w:rPr>
+        <w:rFonts w:ascii="Wingdings" w:hAnsi="Wingdings" w:hint="default"/>
+        <w:sz w:val="20"/>
+      </w:rPr>
+    </w:lvl>
+    <w:lvl w:ilvl="7" w:tentative="1">
+      <w:start w:val="1"/>
+      <w:numFmt w:val="bullet"/>
+      <w:lvlText w:val=""/>
+      <w:lvlJc w:val="left"/>
+      <w:pPr>
+        <w:tabs>
+          <w:tab w:val="num" w:pos="5760"/>
+        </w:tabs>
+        <w:ind w:left="5760" w:hanging="360"/>
+      </w:pPr>
+      <w:rPr>
+        <w:rFonts w:ascii="Wingdings" w:hAnsi="Wingdings" w:hint="default"/>
+        <w:sz w:val="20"/>
+      </w:rPr>
+    </w:lvl>
+    <w:lvl w:ilvl="8" w:tentative="1">
+      <w:start w:val="1"/>
+      <w:numFmt w:val="bullet"/>
+      <w:lvlText w:val=""/>
+      <w:lvlJc w:val="left"/>
+      <w:pPr>
+        <w:tabs>
+          <w:tab w:val="num" w:pos="6480"/>
+        </w:tabs>
+        <w:ind w:left="6480" w:hanging="360"/>
+      </w:pPr>
+      <w:rPr>
+        <w:rFonts w:ascii="Wingdings" w:hAnsi="Wingdings" w:hint="default"/>
+        <w:sz w:val="20"/>
+      </w:rPr>
+    </w:lvl>
+  </w:abstractNum>
+  <w:abstractNum w:abstractNumId="25" w15:restartNumberingAfterBreak="0">
     <w:nsid w:val="7F035AC9"/>
     <w:multiLevelType w:val="multilevel"/>
     <w:tmpl w:val="591C1D36"/>
@@ -9930,61 +11439,82 @@
     </w:lvl>
   </w:abstractNum>
   <w:num w:numId="1" w16cid:durableId="1595164031">
-    <w:abstractNumId w:val="2"/>
+    <w:abstractNumId w:val="4"/>
   </w:num>
   <w:num w:numId="2" w16cid:durableId="1612275815">
-    <w:abstractNumId w:val="14"/>
+    <w:abstractNumId w:val="19"/>
   </w:num>
   <w:num w:numId="3" w16cid:durableId="1957758695">
-    <w:abstractNumId w:val="3"/>
+    <w:abstractNumId w:val="5"/>
   </w:num>
   <w:num w:numId="4" w16cid:durableId="2008365142">
-    <w:abstractNumId w:val="17"/>
+    <w:abstractNumId w:val="23"/>
   </w:num>
   <w:num w:numId="5" w16cid:durableId="863446606">
     <w:abstractNumId w:val="1"/>
   </w:num>
   <w:num w:numId="6" w16cid:durableId="1875345215">
-    <w:abstractNumId w:val="5"/>
+    <w:abstractNumId w:val="7"/>
   </w:num>
   <w:num w:numId="7" w16cid:durableId="2027293402">
-    <w:abstractNumId w:val="11"/>
+    <w:abstractNumId w:val="16"/>
   </w:num>
   <w:num w:numId="8" w16cid:durableId="1712655583">
+    <w:abstractNumId w:val="8"/>
+  </w:num>
+  <w:num w:numId="9" w16cid:durableId="1912694652">
+    <w:abstractNumId w:val="22"/>
+  </w:num>
+  <w:num w:numId="10" w16cid:durableId="1553927216">
     <w:abstractNumId w:val="6"/>
   </w:num>
-  <w:num w:numId="9" w16cid:durableId="1912694652">
-    <w:abstractNumId w:val="16"/>
-  </w:num>
-  <w:num w:numId="10" w16cid:durableId="1553927216">
-    <w:abstractNumId w:val="4"/>
-  </w:num>
   <w:num w:numId="11" w16cid:durableId="1945335712">
-    <w:abstractNumId w:val="18"/>
+    <w:abstractNumId w:val="25"/>
   </w:num>
   <w:num w:numId="12" w16cid:durableId="334456724">
     <w:abstractNumId w:val="0"/>
   </w:num>
   <w:num w:numId="13" w16cid:durableId="22676919">
-    <w:abstractNumId w:val="8"/>
+    <w:abstractNumId w:val="11"/>
   </w:num>
   <w:num w:numId="14" w16cid:durableId="929313436">
+    <w:abstractNumId w:val="18"/>
+  </w:num>
+  <w:num w:numId="15" w16cid:durableId="1392004153">
+    <w:abstractNumId w:val="20"/>
+  </w:num>
+  <w:num w:numId="16" w16cid:durableId="1336570052">
     <w:abstractNumId w:val="13"/>
   </w:num>
-  <w:num w:numId="15" w16cid:durableId="1392004153">
+  <w:num w:numId="17" w16cid:durableId="2043433720">
     <w:abstractNumId w:val="15"/>
   </w:num>
-  <w:num w:numId="16" w16cid:durableId="1336570052">
+  <w:num w:numId="18" w16cid:durableId="520320387">
+    <w:abstractNumId w:val="10"/>
+  </w:num>
+  <w:num w:numId="19" w16cid:durableId="39017208">
+    <w:abstractNumId w:val="17"/>
+  </w:num>
+  <w:num w:numId="20" w16cid:durableId="276564791">
+    <w:abstractNumId w:val="24"/>
+  </w:num>
+  <w:num w:numId="21" w16cid:durableId="1491017115">
+    <w:abstractNumId w:val="14"/>
+  </w:num>
+  <w:num w:numId="22" w16cid:durableId="1152671958">
+    <w:abstractNumId w:val="2"/>
+  </w:num>
+  <w:num w:numId="23" w16cid:durableId="957182986">
     <w:abstractNumId w:val="9"/>
   </w:num>
-  <w:num w:numId="17" w16cid:durableId="2043433720">
-    <w:abstractNumId w:val="10"/>
+  <w:num w:numId="24" w16cid:durableId="1977291959">
+    <w:abstractNumId w:val="21"/>
   </w:num>
-  <w:num w:numId="18" w16cid:durableId="520320387">
-    <w:abstractNumId w:val="7"/>
+  <w:num w:numId="25" w16cid:durableId="2133284629">
+    <w:abstractNumId w:val="12"/>
   </w:num>
-  <w:num w:numId="19" w16cid:durableId="39017208">
-    <w:abstractNumId w:val="12"/>
+  <w:num w:numId="26" w16cid:durableId="620916190">
+    <w:abstractNumId w:val="3"/>
   </w:num>
 </w:numbering>
 </file>

</xml_diff>

<commit_message>
Defense Report Loc added
</commit_message>
<xml_diff>
--- a/Soutenance28-05/Report/Defense.docx
+++ b/Soutenance28-05/Report/Defense.docx
@@ -3193,6 +3193,149 @@
         </w:rPr>
         <w:t xml:space="preserve"> system</w:t>
       </w:r>
+    </w:p>
+    <w:p>
+      <w:pPr>
+        <w:rPr>
+          <w:lang w:val="en-US"/>
+        </w:rPr>
+      </w:pPr>
+      <w:r>
+        <w:rPr>
+          <w:lang w:val="en-US"/>
+        </w:rPr>
+        <w:t>Objectives</w:t>
+      </w:r>
+    </w:p>
+    <w:p>
+      <w:pPr>
+        <w:rPr>
+          <w:lang w:val="en-US"/>
+        </w:rPr>
+      </w:pPr>
+      <w:r>
+        <w:rPr>
+          <w:lang w:val="en-US"/>
+        </w:rPr>
+        <w:t xml:space="preserve">The localization system, while essential for the player to navigate our open world, was relatively straightforward to implement. We wanted true immersion for our map, and compass. Regarding the compass, we initially planned to implement a separate object to indicate the direction the player is facing. However, we realized this would result in a heavy and slow user experience, as the map and compass could not be displayed simultaneously. We therefore decided to integrate the compass directly onto the map. </w:t>
+      </w:r>
+    </w:p>
+    <w:p>
+      <w:pPr>
+        <w:rPr>
+          <w:lang w:val="en-US"/>
+        </w:rPr>
+      </w:pPr>
+      <w:r>
+        <w:rPr>
+          <w:lang w:val="en-US"/>
+        </w:rPr>
+        <w:t xml:space="preserve">We also chose a less realistic approach to the compass: instead of always pointing north, the compass needle moves in the direction the player is heading. This decision was made to reduce the likelihood of the player getting lost, allowing them to focus more on the story and quests, and less on navigation. Given that the game is set in a world full of monsters and magic, we felt this choice did not significantly affect immersion. </w:t>
+      </w:r>
+    </w:p>
+    <w:p>
+      <w:pPr>
+        <w:rPr>
+          <w:lang w:val="en-US"/>
+        </w:rPr>
+      </w:pPr>
+      <w:r>
+        <w:rPr>
+          <w:lang w:val="en-US"/>
+        </w:rPr>
+        <w:t>Implementation</w:t>
+      </w:r>
+    </w:p>
+    <w:p>
+      <w:pPr>
+        <w:rPr>
+          <w:lang w:val="en-US"/>
+        </w:rPr>
+      </w:pPr>
+      <w:r>
+        <w:rPr>
+          <w:lang w:val="en-US"/>
+        </w:rPr>
+        <w:t>The UI that displays the map is a simple layer shown to the player when the map button or the M key is pressed.</w:t>
+      </w:r>
+      <w:r>
+        <w:rPr>
+          <w:lang w:val="en-US"/>
+        </w:rPr>
+        <w:br/>
+        <w:t xml:space="preserve">The needle of the compass is a prefab object that tracks the player rotation along the X axis and </w:t>
+      </w:r>
+      <w:r>
+        <w:rPr>
+          <w:lang w:val="en-US"/>
+        </w:rPr>
+        <w:t>transmits</w:t>
+      </w:r>
+      <w:r>
+        <w:rPr>
+          <w:lang w:val="en-US"/>
+        </w:rPr>
+        <w:t xml:space="preserve"> it to the compass to track which direction the player faces. </w:t>
+      </w:r>
+    </w:p>
+    <w:p>
+      <w:pPr>
+        <w:rPr>
+          <w:lang w:val="en-US"/>
+        </w:rPr>
+      </w:pPr>
+      <w:r>
+        <w:rPr>
+          <w:lang w:val="en-US"/>
+        </w:rPr>
+        <w:t>Results</w:t>
+      </w:r>
+    </w:p>
+    <w:p>
+      <w:pPr>
+        <w:rPr>
+          <w:lang w:val="en-US"/>
+        </w:rPr>
+      </w:pPr>
+      <w:r>
+        <w:rPr>
+          <w:lang w:val="en-US"/>
+        </w:rPr>
+        <w:t xml:space="preserve">Both the map and the compass feel immersive, quick, easy to use while conserving the authenticity of </w:t>
+      </w:r>
+      <w:r>
+        <w:rPr>
+          <w:lang w:val="en-US"/>
+        </w:rPr>
+        <w:t>real-world</w:t>
+      </w:r>
+      <w:r>
+        <w:rPr>
+          <w:lang w:val="en-US"/>
+        </w:rPr>
+        <w:t xml:space="preserve"> </w:t>
+      </w:r>
+      <w:proofErr w:type="gramStart"/>
+      <w:r>
+        <w:rPr>
+          <w:lang w:val="en-US"/>
+        </w:rPr>
+        <w:t>map</w:t>
+      </w:r>
+      <w:proofErr w:type="gramEnd"/>
+      <w:r>
+        <w:rPr>
+          <w:lang w:val="en-US"/>
+        </w:rPr>
+        <w:t xml:space="preserve"> (like not giving away the player’s position) so the experience is still fun and focused on exploration.</w:t>
+      </w:r>
+    </w:p>
+    <w:p>
+      <w:pPr>
+        <w:rPr>
+          <w:lang w:val="en-US"/>
+        </w:rPr>
+      </w:pPr>
     </w:p>
     <w:p>
       <w:pPr>
@@ -10581,6 +10724,119 @@
     </w:lvl>
   </w:abstractNum>
   <w:abstractNum w:abstractNumId="20" w15:restartNumberingAfterBreak="0">
+    <w:nsid w:val="6FEB6979"/>
+    <w:multiLevelType w:val="multilevel"/>
+    <w:tmpl w:val="22381F02"/>
+    <w:lvl w:ilvl="0">
+      <w:start w:val="1"/>
+      <w:numFmt w:val="decimal"/>
+      <w:lvlText w:val="%1."/>
+      <w:lvlJc w:val="left"/>
+      <w:pPr>
+        <w:tabs>
+          <w:tab w:val="num" w:pos="720"/>
+        </w:tabs>
+        <w:ind w:left="720" w:hanging="360"/>
+      </w:pPr>
+    </w:lvl>
+    <w:lvl w:ilvl="1" w:tentative="1">
+      <w:start w:val="1"/>
+      <w:numFmt w:val="decimal"/>
+      <w:lvlText w:val="%2."/>
+      <w:lvlJc w:val="left"/>
+      <w:pPr>
+        <w:tabs>
+          <w:tab w:val="num" w:pos="1440"/>
+        </w:tabs>
+        <w:ind w:left="1440" w:hanging="360"/>
+      </w:pPr>
+    </w:lvl>
+    <w:lvl w:ilvl="2" w:tentative="1">
+      <w:start w:val="1"/>
+      <w:numFmt w:val="decimal"/>
+      <w:lvlText w:val="%3."/>
+      <w:lvlJc w:val="left"/>
+      <w:pPr>
+        <w:tabs>
+          <w:tab w:val="num" w:pos="2160"/>
+        </w:tabs>
+        <w:ind w:left="2160" w:hanging="360"/>
+      </w:pPr>
+    </w:lvl>
+    <w:lvl w:ilvl="3" w:tentative="1">
+      <w:start w:val="1"/>
+      <w:numFmt w:val="decimal"/>
+      <w:lvlText w:val="%4."/>
+      <w:lvlJc w:val="left"/>
+      <w:pPr>
+        <w:tabs>
+          <w:tab w:val="num" w:pos="2880"/>
+        </w:tabs>
+        <w:ind w:left="2880" w:hanging="360"/>
+      </w:pPr>
+    </w:lvl>
+    <w:lvl w:ilvl="4" w:tentative="1">
+      <w:start w:val="1"/>
+      <w:numFmt w:val="decimal"/>
+      <w:lvlText w:val="%5."/>
+      <w:lvlJc w:val="left"/>
+      <w:pPr>
+        <w:tabs>
+          <w:tab w:val="num" w:pos="3600"/>
+        </w:tabs>
+        <w:ind w:left="3600" w:hanging="360"/>
+      </w:pPr>
+    </w:lvl>
+    <w:lvl w:ilvl="5" w:tentative="1">
+      <w:start w:val="1"/>
+      <w:numFmt w:val="decimal"/>
+      <w:lvlText w:val="%6."/>
+      <w:lvlJc w:val="left"/>
+      <w:pPr>
+        <w:tabs>
+          <w:tab w:val="num" w:pos="4320"/>
+        </w:tabs>
+        <w:ind w:left="4320" w:hanging="360"/>
+      </w:pPr>
+    </w:lvl>
+    <w:lvl w:ilvl="6" w:tentative="1">
+      <w:start w:val="1"/>
+      <w:numFmt w:val="decimal"/>
+      <w:lvlText w:val="%7."/>
+      <w:lvlJc w:val="left"/>
+      <w:pPr>
+        <w:tabs>
+          <w:tab w:val="num" w:pos="5040"/>
+        </w:tabs>
+        <w:ind w:left="5040" w:hanging="360"/>
+      </w:pPr>
+    </w:lvl>
+    <w:lvl w:ilvl="7" w:tentative="1">
+      <w:start w:val="1"/>
+      <w:numFmt w:val="decimal"/>
+      <w:lvlText w:val="%8."/>
+      <w:lvlJc w:val="left"/>
+      <w:pPr>
+        <w:tabs>
+          <w:tab w:val="num" w:pos="5760"/>
+        </w:tabs>
+        <w:ind w:left="5760" w:hanging="360"/>
+      </w:pPr>
+    </w:lvl>
+    <w:lvl w:ilvl="8" w:tentative="1">
+      <w:start w:val="1"/>
+      <w:numFmt w:val="decimal"/>
+      <w:lvlText w:val="%9."/>
+      <w:lvlJc w:val="left"/>
+      <w:pPr>
+        <w:tabs>
+          <w:tab w:val="num" w:pos="6480"/>
+        </w:tabs>
+        <w:ind w:left="6480" w:hanging="360"/>
+      </w:pPr>
+    </w:lvl>
+  </w:abstractNum>
+  <w:abstractNum w:abstractNumId="21" w15:restartNumberingAfterBreak="0">
     <w:nsid w:val="70356058"/>
     <w:multiLevelType w:val="multilevel"/>
     <w:tmpl w:val="9EFEEACE"/>
@@ -10729,7 +10985,7 @@
       </w:rPr>
     </w:lvl>
   </w:abstractNum>
-  <w:abstractNum w:abstractNumId="21" w15:restartNumberingAfterBreak="0">
+  <w:abstractNum w:abstractNumId="22" w15:restartNumberingAfterBreak="0">
     <w:nsid w:val="70ED0C80"/>
     <w:multiLevelType w:val="multilevel"/>
     <w:tmpl w:val="5C78D676"/>
@@ -10878,7 +11134,7 @@
       </w:rPr>
     </w:lvl>
   </w:abstractNum>
-  <w:abstractNum w:abstractNumId="22" w15:restartNumberingAfterBreak="0">
+  <w:abstractNum w:abstractNumId="23" w15:restartNumberingAfterBreak="0">
     <w:nsid w:val="74ED0413"/>
     <w:multiLevelType w:val="multilevel"/>
     <w:tmpl w:val="1B8051DC"/>
@@ -10991,7 +11247,7 @@
       </w:pPr>
     </w:lvl>
   </w:abstractNum>
-  <w:abstractNum w:abstractNumId="23" w15:restartNumberingAfterBreak="0">
+  <w:abstractNum w:abstractNumId="24" w15:restartNumberingAfterBreak="0">
     <w:nsid w:val="75C006B2"/>
     <w:multiLevelType w:val="multilevel"/>
     <w:tmpl w:val="3B664762"/>
@@ -11140,7 +11396,7 @@
       </w:rPr>
     </w:lvl>
   </w:abstractNum>
-  <w:abstractNum w:abstractNumId="24" w15:restartNumberingAfterBreak="0">
+  <w:abstractNum w:abstractNumId="25" w15:restartNumberingAfterBreak="0">
     <w:nsid w:val="7961492B"/>
     <w:multiLevelType w:val="multilevel"/>
     <w:tmpl w:val="6A76BC6C"/>
@@ -11289,7 +11545,7 @@
       </w:rPr>
     </w:lvl>
   </w:abstractNum>
-  <w:abstractNum w:abstractNumId="25" w15:restartNumberingAfterBreak="0">
+  <w:abstractNum w:abstractNumId="26" w15:restartNumberingAfterBreak="0">
     <w:nsid w:val="7F035AC9"/>
     <w:multiLevelType w:val="multilevel"/>
     <w:tmpl w:val="591C1D36"/>
@@ -11448,7 +11704,7 @@
     <w:abstractNumId w:val="5"/>
   </w:num>
   <w:num w:numId="4" w16cid:durableId="2008365142">
-    <w:abstractNumId w:val="23"/>
+    <w:abstractNumId w:val="24"/>
   </w:num>
   <w:num w:numId="5" w16cid:durableId="863446606">
     <w:abstractNumId w:val="1"/>
@@ -11463,13 +11719,13 @@
     <w:abstractNumId w:val="8"/>
   </w:num>
   <w:num w:numId="9" w16cid:durableId="1912694652">
-    <w:abstractNumId w:val="22"/>
+    <w:abstractNumId w:val="23"/>
   </w:num>
   <w:num w:numId="10" w16cid:durableId="1553927216">
     <w:abstractNumId w:val="6"/>
   </w:num>
   <w:num w:numId="11" w16cid:durableId="1945335712">
-    <w:abstractNumId w:val="25"/>
+    <w:abstractNumId w:val="26"/>
   </w:num>
   <w:num w:numId="12" w16cid:durableId="334456724">
     <w:abstractNumId w:val="0"/>
@@ -11481,7 +11737,7 @@
     <w:abstractNumId w:val="18"/>
   </w:num>
   <w:num w:numId="15" w16cid:durableId="1392004153">
-    <w:abstractNumId w:val="20"/>
+    <w:abstractNumId w:val="21"/>
   </w:num>
   <w:num w:numId="16" w16cid:durableId="1336570052">
     <w:abstractNumId w:val="13"/>
@@ -11496,7 +11752,7 @@
     <w:abstractNumId w:val="17"/>
   </w:num>
   <w:num w:numId="20" w16cid:durableId="276564791">
-    <w:abstractNumId w:val="24"/>
+    <w:abstractNumId w:val="25"/>
   </w:num>
   <w:num w:numId="21" w16cid:durableId="1491017115">
     <w:abstractNumId w:val="14"/>
@@ -11508,13 +11764,16 @@
     <w:abstractNumId w:val="9"/>
   </w:num>
   <w:num w:numId="24" w16cid:durableId="1977291959">
-    <w:abstractNumId w:val="21"/>
+    <w:abstractNumId w:val="22"/>
   </w:num>
   <w:num w:numId="25" w16cid:durableId="2133284629">
     <w:abstractNumId w:val="12"/>
   </w:num>
   <w:num w:numId="26" w16cid:durableId="620916190">
     <w:abstractNumId w:val="3"/>
+  </w:num>
+  <w:num w:numId="27" w16cid:durableId="222374164">
+    <w:abstractNumId w:val="20"/>
   </w:num>
 </w:numbering>
 </file>

</xml_diff>